<commit_message>
lab 3 in lab and post lab, no report yet
</commit_message>
<xml_diff>
--- a/lab2_template/ELEC475_Lab2_Report_Vince_song.docx
+++ b/lab2_template/ELEC475_Lab2_Report_Vince_song.docx
@@ -44,7 +44,23 @@
           <w:sz w:val="48"/>
           <w:szCs w:val="48"/>
         </w:rPr>
-        <w:t>ELEC 475 PostLab 2</w:t>
+        <w:t xml:space="preserve">ELEC 475 </w:t>
+      </w:r>
+      <w:proofErr w:type="spellStart"/>
+      <w:r>
+        <w:rPr>
+          <w:sz w:val="48"/>
+          <w:szCs w:val="48"/>
+        </w:rPr>
+        <w:t>PostLab</w:t>
+      </w:r>
+      <w:proofErr w:type="spellEnd"/>
+      <w:r>
+        <w:rPr>
+          <w:sz w:val="48"/>
+          <w:szCs w:val="48"/>
+        </w:rPr>
+        <w:t xml:space="preserve"> 2</w:t>
       </w:r>
     </w:p>
     <w:p>
@@ -62,6 +78,30 @@
           <w:szCs w:val="32"/>
         </w:rPr>
         <w:t>Vince Song</w:t>
+      </w:r>
+    </w:p>
+    <w:p>
+      <w:pPr>
+        <w:pStyle w:val="Heading2"/>
+        <w:jc w:val="center"/>
+        <w:rPr>
+          <w:sz w:val="32"/>
+          <w:szCs w:val="32"/>
+        </w:rPr>
+      </w:pPr>
+      <w:r>
+        <w:rPr>
+          <w:sz w:val="32"/>
+          <w:szCs w:val="32"/>
+        </w:rPr>
+        <w:t xml:space="preserve">Group </w:t>
+      </w:r>
+      <w:r>
+        <w:rPr>
+          <w:sz w:val="32"/>
+          <w:szCs w:val="32"/>
+        </w:rPr>
+        <w:t>86</w:t>
       </w:r>
     </w:p>
     <w:p>
@@ -175,7 +215,88 @@
         <w:rPr>
           <w:sz w:val="22"/>
         </w:rPr>
-        <w:t>Describe the exact implementation used in models/lenet.py and models/lenet_modern.py. Include each convolution or pooling operation, channel count, kernel, stride, padding, output tensor shape, classifier dimensions, and trainable parameter count. Use the shapes produced by the code rather than assuming they match a textbook LeNet.</w:t>
+        <w:t xml:space="preserve">Both the </w:t>
+      </w:r>
+      <w:proofErr w:type="spellStart"/>
+      <w:r>
+        <w:rPr>
+          <w:sz w:val="22"/>
+        </w:rPr>
+        <w:t>lenet</w:t>
+      </w:r>
+      <w:proofErr w:type="spellEnd"/>
+      <w:r>
+        <w:rPr>
+          <w:sz w:val="22"/>
+        </w:rPr>
+        <w:t xml:space="preserve"> and modernized </w:t>
+      </w:r>
+      <w:proofErr w:type="spellStart"/>
+      <w:r>
+        <w:rPr>
+          <w:sz w:val="22"/>
+        </w:rPr>
+        <w:t>lenet</w:t>
+      </w:r>
+      <w:proofErr w:type="spellEnd"/>
+      <w:r>
+        <w:rPr>
+          <w:sz w:val="22"/>
+        </w:rPr>
+        <w:t xml:space="preserve"> models process 64x64 RGB images and use two convolutional layers followed by three fully connected layers. </w:t>
+      </w:r>
+    </w:p>
+    <w:p>
+      <w:pPr>
+        <w:rPr>
+          <w:sz w:val="22"/>
+        </w:rPr>
+      </w:pPr>
+      <w:r>
+        <w:rPr>
+          <w:sz w:val="22"/>
+        </w:rPr>
+        <w:t>Base LeNet-5 uses Tanh activations, 5×5 convolutions without padding, and 2×2 average pooling. Modernized LeNet uses ReLU, padded 5×5 convolutions, and overlapping 3×3 max pooling. Its larger final feature map increases the first fully connected layer and the total parameter count (Table 1).</w:t>
+      </w:r>
+    </w:p>
+    <w:p>
+      <w:pPr>
+        <w:pStyle w:val="Caption"/>
+        <w:keepNext/>
+      </w:pPr>
+      <w:bookmarkStart w:id="0" w:name="_Ref243591098"/>
+      <w:r>
+        <w:t xml:space="preserve">Table </w:t>
+      </w:r>
+      <w:r>
+        <w:fldChar w:fldCharType="begin"/>
+      </w:r>
+      <w:r>
+        <w:instrText xml:space="preserve"> SEQ Table \* ARABIC </w:instrText>
+      </w:r>
+      <w:r>
+        <w:fldChar w:fldCharType="separate"/>
+      </w:r>
+      <w:r>
+        <w:rPr>
+          <w:noProof/>
+        </w:rPr>
+        <w:t>1</w:t>
+      </w:r>
+      <w:r>
+        <w:fldChar w:fldCharType="end"/>
+      </w:r>
+      <w:bookmarkEnd w:id="0"/>
+      <w:r>
+        <w:t xml:space="preserve">: Base </w:t>
+      </w:r>
+      <w:proofErr w:type="spellStart"/>
+      <w:r>
+        <w:t>lenet</w:t>
+      </w:r>
+      <w:proofErr w:type="spellEnd"/>
+      <w:r>
+        <w:t xml:space="preserve"> vs Modernized Lenet differences</w:t>
       </w:r>
     </w:p>
     <w:tbl>
@@ -367,11 +488,19 @@
                 <w:sz w:val="22"/>
               </w:rPr>
             </w:pPr>
-            <w:r>
-              <w:rPr>
-                <w:sz w:val="22"/>
-              </w:rPr>
-              <w:t>ReLU; overlapping max pooling</w:t>
+            <w:proofErr w:type="spellStart"/>
+            <w:r>
+              <w:rPr>
+                <w:sz w:val="22"/>
+              </w:rPr>
+              <w:t>ReLU</w:t>
+            </w:r>
+            <w:proofErr w:type="spellEnd"/>
+            <w:r>
+              <w:rPr>
+                <w:sz w:val="22"/>
+              </w:rPr>
+              <w:t>; overlapping max pooling</w:t>
             </w:r>
           </w:p>
         </w:tc>
@@ -417,7 +546,45 @@
         <w:rPr>
           <w:sz w:val="22"/>
         </w:rPr>
-        <w:t>The supplied specification uses a 64×64 RGB input and five convolutional stages. For the normalization ablation, the normalization operation is configurable: identity (none), LocalResponseNorm, or BatchNorm2d. The spatial sizes below follow the specified kernel, stride, and padding values.</w:t>
+        <w:t>The supplied AlexNet-64 processes 64×64 RGB images through five convolutional stages. Normalization is configurable (identity, LRN, or BatchNorm2d). In the measured LRN model, normalization is applied after the first two convolutions; the remaining stages use identity layers. Table 2 shows the spatial dimensions from the model implementation.</w:t>
+      </w:r>
+    </w:p>
+    <w:p>
+      <w:pPr>
+        <w:pStyle w:val="Caption"/>
+        <w:keepNext/>
+      </w:pPr>
+      <w:r>
+        <w:t xml:space="preserve">Table </w:t>
+      </w:r>
+      <w:r>
+        <w:fldChar w:fldCharType="begin"/>
+      </w:r>
+      <w:r>
+        <w:instrText xml:space="preserve"> SEQ Table \* ARABIC </w:instrText>
+      </w:r>
+      <w:r>
+        <w:fldChar w:fldCharType="separate"/>
+      </w:r>
+      <w:r>
+        <w:rPr>
+          <w:noProof/>
+        </w:rPr>
+        <w:t>2</w:t>
+      </w:r>
+      <w:r>
+        <w:fldChar w:fldCharType="end"/>
+      </w:r>
+      <w:r>
+        <w:t xml:space="preserve">: </w:t>
+      </w:r>
+      <w:proofErr w:type="spellStart"/>
+      <w:r>
+        <w:t>Alexnet</w:t>
+      </w:r>
+      <w:proofErr w:type="spellEnd"/>
+      <w:r>
+        <w:t xml:space="preserve"> architecture breakdown</w:t>
       </w:r>
     </w:p>
     <w:tbl>
@@ -613,7 +780,35 @@
               <w:rPr>
                 <w:sz w:val="22"/>
               </w:rPr>
-              <w:t>Conv 5×5, s=2, p=2, 64 filters → norm → ReLU → MaxPool 3×3, s=2</w:t>
+              <w:t xml:space="preserve">Conv 5×5, s=2, p=2, 64 filters → norm → </w:t>
+            </w:r>
+            <w:proofErr w:type="spellStart"/>
+            <w:r>
+              <w:rPr>
+                <w:sz w:val="22"/>
+              </w:rPr>
+              <w:t>ReLU</w:t>
+            </w:r>
+            <w:proofErr w:type="spellEnd"/>
+            <w:r>
+              <w:rPr>
+                <w:sz w:val="22"/>
+              </w:rPr>
+              <w:t xml:space="preserve"> → </w:t>
+            </w:r>
+            <w:proofErr w:type="spellStart"/>
+            <w:r>
+              <w:rPr>
+                <w:sz w:val="22"/>
+              </w:rPr>
+              <w:t>MaxPool</w:t>
+            </w:r>
+            <w:proofErr w:type="spellEnd"/>
+            <w:r>
+              <w:rPr>
+                <w:sz w:val="22"/>
+              </w:rPr>
+              <w:t xml:space="preserve"> 3×3, s=2</w:t>
             </w:r>
           </w:p>
         </w:tc>
@@ -679,7 +874,35 @@
               <w:rPr>
                 <w:sz w:val="22"/>
               </w:rPr>
-              <w:t>Conv 5×5, s=1, p=2, 192 filters → norm → ReLU → MaxPool 3×3, s=2</w:t>
+              <w:t xml:space="preserve">Conv 5×5, s=1, p=2, 192 filters → norm → </w:t>
+            </w:r>
+            <w:proofErr w:type="spellStart"/>
+            <w:r>
+              <w:rPr>
+                <w:sz w:val="22"/>
+              </w:rPr>
+              <w:t>ReLU</w:t>
+            </w:r>
+            <w:proofErr w:type="spellEnd"/>
+            <w:r>
+              <w:rPr>
+                <w:sz w:val="22"/>
+              </w:rPr>
+              <w:t xml:space="preserve"> → </w:t>
+            </w:r>
+            <w:proofErr w:type="spellStart"/>
+            <w:r>
+              <w:rPr>
+                <w:sz w:val="22"/>
+              </w:rPr>
+              <w:t>MaxPool</w:t>
+            </w:r>
+            <w:proofErr w:type="spellEnd"/>
+            <w:r>
+              <w:rPr>
+                <w:sz w:val="22"/>
+              </w:rPr>
+              <w:t xml:space="preserve"> 3×3, s=2</w:t>
             </w:r>
           </w:p>
         </w:tc>
@@ -746,8 +969,16 @@
               <w:rPr>
                 <w:sz w:val="22"/>
               </w:rPr>
-              <w:t>Conv 3×3, s=1, p=1, 384 filters → norm → ReLU</w:t>
-            </w:r>
+              <w:t xml:space="preserve">Conv 3×3, s=1, p=1, 384 filters → norm → </w:t>
+            </w:r>
+            <w:proofErr w:type="spellStart"/>
+            <w:r>
+              <w:rPr>
+                <w:sz w:val="22"/>
+              </w:rPr>
+              <w:t>ReLU</w:t>
+            </w:r>
+            <w:proofErr w:type="spellEnd"/>
           </w:p>
         </w:tc>
         <w:tc>
@@ -812,8 +1043,16 @@
               <w:rPr>
                 <w:sz w:val="22"/>
               </w:rPr>
-              <w:t>Conv 3×3, s=1, p=1, 384 filters → norm → ReLU</w:t>
-            </w:r>
+              <w:t xml:space="preserve">Conv 3×3, s=1, p=1, 384 filters → norm → </w:t>
+            </w:r>
+            <w:proofErr w:type="spellStart"/>
+            <w:r>
+              <w:rPr>
+                <w:sz w:val="22"/>
+              </w:rPr>
+              <w:t>ReLU</w:t>
+            </w:r>
+            <w:proofErr w:type="spellEnd"/>
           </w:p>
         </w:tc>
         <w:tc>
@@ -879,7 +1118,35 @@
               <w:rPr>
                 <w:sz w:val="22"/>
               </w:rPr>
-              <w:t>Conv 3×3, s=1, p=1, 256 filters → norm → ReLU → MaxPool 3×3, s=2</w:t>
+              <w:t xml:space="preserve">Conv 3×3, s=1, p=1, 256 filters → norm → </w:t>
+            </w:r>
+            <w:proofErr w:type="spellStart"/>
+            <w:r>
+              <w:rPr>
+                <w:sz w:val="22"/>
+              </w:rPr>
+              <w:t>ReLU</w:t>
+            </w:r>
+            <w:proofErr w:type="spellEnd"/>
+            <w:r>
+              <w:rPr>
+                <w:sz w:val="22"/>
+              </w:rPr>
+              <w:t xml:space="preserve"> → </w:t>
+            </w:r>
+            <w:proofErr w:type="spellStart"/>
+            <w:r>
+              <w:rPr>
+                <w:sz w:val="22"/>
+              </w:rPr>
+              <w:t>MaxPool</w:t>
+            </w:r>
+            <w:proofErr w:type="spellEnd"/>
+            <w:r>
+              <w:rPr>
+                <w:sz w:val="22"/>
+              </w:rPr>
+              <w:t xml:space="preserve"> 3×3, s=2</w:t>
             </w:r>
           </w:p>
         </w:tc>
@@ -945,7 +1212,63 @@
               <w:rPr>
                 <w:sz w:val="22"/>
               </w:rPr>
-              <w:t>Flatten 2304 → Dropout(.5) → FC 1024 → ReLU → Dropout(.5) → FC 1024 → ReLU → FC classes</w:t>
+              <w:t xml:space="preserve">Flatten 2304 → </w:t>
+            </w:r>
+            <w:proofErr w:type="gramStart"/>
+            <w:r>
+              <w:rPr>
+                <w:sz w:val="22"/>
+              </w:rPr>
+              <w:t>Dropout(</w:t>
+            </w:r>
+            <w:proofErr w:type="gramEnd"/>
+            <w:r>
+              <w:rPr>
+                <w:sz w:val="22"/>
+              </w:rPr>
+              <w:t xml:space="preserve">.5) → FC 1024 → </w:t>
+            </w:r>
+            <w:proofErr w:type="spellStart"/>
+            <w:r>
+              <w:rPr>
+                <w:sz w:val="22"/>
+              </w:rPr>
+              <w:t>ReLU</w:t>
+            </w:r>
+            <w:proofErr w:type="spellEnd"/>
+            <w:r>
+              <w:rPr>
+                <w:sz w:val="22"/>
+              </w:rPr>
+              <w:t xml:space="preserve"> → </w:t>
+            </w:r>
+            <w:proofErr w:type="gramStart"/>
+            <w:r>
+              <w:rPr>
+                <w:sz w:val="22"/>
+              </w:rPr>
+              <w:t>Dropout(</w:t>
+            </w:r>
+            <w:proofErr w:type="gramEnd"/>
+            <w:r>
+              <w:rPr>
+                <w:sz w:val="22"/>
+              </w:rPr>
+              <w:t xml:space="preserve">.5) → FC 1024 → </w:t>
+            </w:r>
+            <w:proofErr w:type="spellStart"/>
+            <w:r>
+              <w:rPr>
+                <w:sz w:val="22"/>
+              </w:rPr>
+              <w:t>ReLU</w:t>
+            </w:r>
+            <w:proofErr w:type="spellEnd"/>
+            <w:r>
+              <w:rPr>
+                <w:sz w:val="22"/>
+              </w:rPr>
+              <w:t xml:space="preserve"> → FC classes</w:t>
             </w:r>
           </w:p>
         </w:tc>
@@ -961,12 +1284,14 @@
                 <w:sz w:val="22"/>
               </w:rPr>
             </w:pPr>
+            <w:proofErr w:type="spellStart"/>
             <w:r>
               <w:rPr>
                 <w:sz w:val="22"/>
               </w:rPr>
               <w:t>num_classes</w:t>
             </w:r>
+            <w:proofErr w:type="spellEnd"/>
           </w:p>
         </w:tc>
       </w:tr>
@@ -988,15 +1313,7 @@
         <w:rPr>
           <w:sz w:val="22"/>
         </w:rPr>
-        <w:t>Spatial-size calculation for a convolution or pooling layer: output = floor((input + 2×padding − kernel_size)/stride) + 1. For example, stage 1 convolution gives floor((64 + 4 − 5)/2)+1 = 32; its 3×3, stride-2 pool gives floor((32 − 3)/2)+1 = 15. The final pooled tensor contains 256×3×3 = 2,304 features.</w:t>
-      </w:r>
-    </w:p>
-    <w:p>
-      <w:pPr>
-        <w:pStyle w:val="Heading2"/>
-      </w:pPr>
-      <w:r>
-        <w:t>Parameter and receptive-field analysis</w:t>
+        <w:t xml:space="preserve">Spatial-size calculation for a convolution or pooling layer: </w:t>
       </w:r>
     </w:p>
     <w:p>
@@ -1005,12 +1322,66 @@
           <w:sz w:val="22"/>
         </w:rPr>
       </w:pPr>
-      <w:r>
-        <w:rPr>
-          <w:sz w:val="22"/>
-        </w:rPr>
-        <w:t>For a convolution with bias, trainable parameters = out_channels × (in_channels × kernel_height × kernel_width + 1). For a linear layer, parameters = out_features × (in_features + 1). BatchNorm adds learnable scale and offset per channel (2C parameters); LRN and identity normalization add no trainable parameters. State whether the profiler reports parameters, MACs, or FLOPs, and use one convention consistently. Some tools count one multiply-add as one MAC or as two FLOPs.</w:t>
-      </w:r>
+      <m:oMathPara>
+        <m:oMath>
+          <m:r>
+            <w:rPr>
+              <w:rFonts w:ascii="Cambria Math" w:hAnsi="Cambria Math"/>
+              <w:sz w:val="22"/>
+            </w:rPr>
+            <m:t>O=</m:t>
+          </m:r>
+          <m:f>
+            <m:fPr>
+              <m:ctrlPr>
+                <w:rPr>
+                  <w:rFonts w:ascii="Cambria Math" w:hAnsi="Cambria Math"/>
+                  <w:i/>
+                  <w:sz w:val="22"/>
+                </w:rPr>
+              </m:ctrlPr>
+            </m:fPr>
+            <m:num>
+              <m:d>
+                <m:dPr>
+                  <m:ctrlPr>
+                    <w:rPr>
+                      <w:rFonts w:ascii="Cambria Math" w:hAnsi="Cambria Math"/>
+                      <w:i/>
+                      <w:sz w:val="22"/>
+                    </w:rPr>
+                  </m:ctrlPr>
+                </m:dPr>
+                <m:e>
+                  <m:r>
+                    <w:rPr>
+                      <w:rFonts w:ascii="Cambria Math" w:hAnsi="Cambria Math"/>
+                      <w:sz w:val="22"/>
+                    </w:rPr>
+                    <m:t>I+2P-K</m:t>
+                  </m:r>
+                </m:e>
+              </m:d>
+            </m:num>
+            <m:den>
+              <m:r>
+                <w:rPr>
+                  <w:rFonts w:ascii="Cambria Math" w:hAnsi="Cambria Math"/>
+                  <w:sz w:val="22"/>
+                </w:rPr>
+                <m:t>S</m:t>
+              </m:r>
+            </m:den>
+          </m:f>
+          <m:r>
+            <w:rPr>
+              <w:rFonts w:ascii="Cambria Math" w:hAnsi="Cambria Math"/>
+              <w:sz w:val="22"/>
+            </w:rPr>
+            <m:t>+1</m:t>
+          </m:r>
+        </m:oMath>
+      </m:oMathPara>
     </w:p>
     <w:p>
       <w:pPr>
@@ -1018,11 +1389,77 @@
           <w:sz w:val="22"/>
         </w:rPr>
       </w:pPr>
-      <w:r>
+    </w:p>
+    <w:p>
+      <w:pPr>
+        <w:pStyle w:val="Heading2"/>
+      </w:pPr>
+      <w:r>
+        <w:t>Parameter and receptive-field analysis</w:t>
+      </w:r>
+    </w:p>
+    <w:p>
+      <w:pPr>
         <w:rPr>
           <w:sz w:val="22"/>
         </w:rPr>
-        <w:t>Receptive field: for each layer l, track receptive-field size r_l and effective stride j_l. Initialize r_0=1 and j_0=1. For kernel k_l and stride s_l, r_l = r_(l−1) + (k_l−1)j_(l−1), and j_l = j_(l−1)s_l. Apply this recursively through convolution and pooling layers; padding affects boundary coverage but not this nominal receptive-field recurrence.</w:t>
+      </w:pPr>
+      <w:r>
+        <w:rPr>
+          <w:sz w:val="22"/>
+        </w:rPr>
+        <w:t xml:space="preserve">The number of trainable parameters depends on the size and number of filters in each layer. Convolutional and fully connected layers both have trainable weights and biases. </w:t>
+      </w:r>
+      <w:proofErr w:type="spellStart"/>
+      <w:r>
+        <w:rPr>
+          <w:sz w:val="22"/>
+        </w:rPr>
+        <w:t>BatchNorm</w:t>
+      </w:r>
+      <w:proofErr w:type="spellEnd"/>
+      <w:r>
+        <w:rPr>
+          <w:sz w:val="22"/>
+        </w:rPr>
+        <w:t xml:space="preserve"> adds two trainable parameters per channel, while LRN and no normalization add none. The profiler measures model parameters, MACs, and FLOPs, where 1 MAC is counted as 2 FLOPs.</w:t>
+      </w:r>
+    </w:p>
+    <w:p>
+      <w:pPr>
+        <w:rPr>
+          <w:sz w:val="22"/>
+        </w:rPr>
+      </w:pPr>
+    </w:p>
+    <w:p>
+      <w:pPr>
+        <w:pStyle w:val="Caption"/>
+        <w:keepNext/>
+      </w:pPr>
+      <w:r>
+        <w:t xml:space="preserve">Table </w:t>
+      </w:r>
+      <w:r>
+        <w:fldChar w:fldCharType="begin"/>
+      </w:r>
+      <w:r>
+        <w:instrText xml:space="preserve"> SEQ Table \* ARABIC </w:instrText>
+      </w:r>
+      <w:r>
+        <w:fldChar w:fldCharType="separate"/>
+      </w:r>
+      <w:r>
+        <w:rPr>
+          <w:noProof/>
+        </w:rPr>
+        <w:t>3</w:t>
+      </w:r>
+      <w:r>
+        <w:fldChar w:fldCharType="end"/>
+      </w:r>
+      <w:r>
+        <w:t>: Comparison of Calculated parameters across CNN architectures</w:t>
       </w:r>
     </w:p>
     <w:tbl>
@@ -1061,7 +1498,6 @@
                 <w:color w:val="FFFFFF"/>
                 <w:sz w:val="22"/>
               </w:rPr>
-              <w:lastRenderedPageBreak/>
               <w:t>Model / layer</w:t>
             </w:r>
           </w:p>
@@ -1458,8 +1894,16 @@
               <w:rPr>
                 <w:sz w:val="22"/>
               </w:rPr>
-              <w:t>3,420,170 classifier</w:t>
-            </w:r>
+              <w:t xml:space="preserve">3,420,170 </w:t>
+            </w:r>
+            <w:proofErr w:type="gramStart"/>
+            <w:r>
+              <w:rPr>
+                <w:sz w:val="22"/>
+              </w:rPr>
+              <w:t>classifier</w:t>
+            </w:r>
+            <w:proofErr w:type="gramEnd"/>
           </w:p>
         </w:tc>
         <w:tc>
@@ -1500,12 +1944,28 @@
                 <w:sz w:val="22"/>
               </w:rPr>
             </w:pPr>
-            <w:r>
-              <w:rPr>
-                <w:sz w:val="22"/>
-              </w:rPr>
-              <w:t>PyTorch Zoo AlexNet</w:t>
-            </w:r>
+            <w:proofErr w:type="spellStart"/>
+            <w:r>
+              <w:rPr>
+                <w:sz w:val="22"/>
+              </w:rPr>
+              <w:t>PyTorch</w:t>
+            </w:r>
+            <w:proofErr w:type="spellEnd"/>
+            <w:r>
+              <w:rPr>
+                <w:sz w:val="22"/>
+              </w:rPr>
+              <w:t xml:space="preserve"> Zoo </w:t>
+            </w:r>
+            <w:proofErr w:type="spellStart"/>
+            <w:r>
+              <w:rPr>
+                <w:sz w:val="22"/>
+              </w:rPr>
+              <w:t>AlexNet</w:t>
+            </w:r>
+            <w:proofErr w:type="spellEnd"/>
           </w:p>
         </w:tc>
         <w:tc>
@@ -1564,7 +2024,35 @@
               <w:rPr>
                 <w:sz w:val="22"/>
               </w:rPr>
-              <w:t>Measured exact layer breakdown from 10-class torchvision AlexNet (64×64 input); FLOPs = 2× MACs.</w:t>
+              <w:t xml:space="preserve">Measured exact layer breakdown from 10-class </w:t>
+            </w:r>
+            <w:proofErr w:type="spellStart"/>
+            <w:r>
+              <w:rPr>
+                <w:sz w:val="22"/>
+              </w:rPr>
+              <w:t>torchvision</w:t>
+            </w:r>
+            <w:proofErr w:type="spellEnd"/>
+            <w:r>
+              <w:rPr>
+                <w:sz w:val="22"/>
+              </w:rPr>
+              <w:t xml:space="preserve"> </w:t>
+            </w:r>
+            <w:proofErr w:type="spellStart"/>
+            <w:r>
+              <w:rPr>
+                <w:sz w:val="22"/>
+              </w:rPr>
+              <w:t>AlexNet</w:t>
+            </w:r>
+            <w:proofErr w:type="spellEnd"/>
+            <w:r>
+              <w:rPr>
+                <w:sz w:val="22"/>
+              </w:rPr>
+              <w:t xml:space="preserve"> (64×64 input); FLOPs = 2× MACs.</w:t>
             </w:r>
           </w:p>
         </w:tc>
@@ -1582,6 +2070,74 @@
       <w:r>
         <w:t>Normalization results (measured)</w:t>
       </w:r>
+    </w:p>
+    <w:p>
+      <w:pPr>
+        <w:pStyle w:val="Caption"/>
+        <w:rPr>
+          <w:sz w:val="22"/>
+          <w:szCs w:val="22"/>
+        </w:rPr>
+      </w:pPr>
+      <w:r>
+        <w:rPr>
+          <w:sz w:val="22"/>
+          <w:szCs w:val="22"/>
+        </w:rPr>
+        <w:t xml:space="preserve">Table </w:t>
+      </w:r>
+      <w:r>
+        <w:rPr>
+          <w:sz w:val="22"/>
+          <w:szCs w:val="22"/>
+        </w:rPr>
+        <w:fldChar w:fldCharType="begin"/>
+      </w:r>
+      <w:r>
+        <w:rPr>
+          <w:sz w:val="22"/>
+          <w:szCs w:val="22"/>
+        </w:rPr>
+        <w:instrText xml:space="preserve"> SEQ Table \* ARABIC </w:instrText>
+      </w:r>
+      <w:r>
+        <w:rPr>
+          <w:sz w:val="22"/>
+          <w:szCs w:val="22"/>
+        </w:rPr>
+        <w:fldChar w:fldCharType="separate"/>
+      </w:r>
+      <w:r>
+        <w:rPr>
+          <w:noProof/>
+          <w:sz w:val="22"/>
+          <w:szCs w:val="22"/>
+        </w:rPr>
+        <w:t>4</w:t>
+      </w:r>
+      <w:r>
+        <w:rPr>
+          <w:sz w:val="22"/>
+          <w:szCs w:val="22"/>
+        </w:rPr>
+        <w:fldChar w:fldCharType="end"/>
+      </w:r>
+      <w:r>
+        <w:rPr>
+          <w:sz w:val="22"/>
+          <w:szCs w:val="22"/>
+        </w:rPr>
+        <w:t xml:space="preserve">: Normalized Results for </w:t>
+      </w:r>
+      <w:proofErr w:type="spellStart"/>
+      <w:r>
+        <w:rPr>
+          <w:sz w:val="22"/>
+          <w:szCs w:val="22"/>
+        </w:rPr>
+        <w:t>Alexnet</w:t>
+      </w:r>
+      <w:proofErr w:type="spellEnd"/>
     </w:p>
     <w:tbl>
       <w:tblPr>
@@ -1682,6 +2238,7 @@
                 <w:sz w:val="22"/>
               </w:rPr>
             </w:pPr>
+            <w:proofErr w:type="spellStart"/>
             <w:r>
               <w:rPr>
                 <w:b/>
@@ -1690,6 +2247,7 @@
               </w:rPr>
               <w:t>BatchNorm</w:t>
             </w:r>
+            <w:proofErr w:type="spellEnd"/>
           </w:p>
         </w:tc>
       </w:tr>
@@ -2368,24 +2926,19 @@
     </w:tbl>
     <w:p>
       <w:pPr>
-        <w:pStyle w:val="Heading3"/>
-        <w:rPr>
-          <w:sz w:val="22"/>
-        </w:rPr>
+        <w:pStyle w:val="Heading2"/>
       </w:pPr>
       <w:r>
-        <w:rPr>
-          <w:sz w:val="22"/>
-        </w:rPr>
-        <w:t>Performance Improvement: Did incorporating Batch Normalization yield an improvement in validation accuracy and Macro \(F_1\) over No Normalization and LRN? (Yes / No). If Yes: Explain the underlying mathematical and optimization reasons. How does normalizing mini-batch activations reduce internal covariate shift and smooth the optimization landscape? If No or Marginal: Discuss what experimental parameters (e.g., choice of learning rate, batch size, or short 10-epoch horizon) may have limited the observable gains.</w:t>
-      </w:r>
-    </w:p>
-    <w:p>
-      <w:pPr>
-        <w:rPr>
-          <w:sz w:val="22"/>
-        </w:rPr>
-      </w:pPr>
+        <w:t xml:space="preserve">Performance Improvement: Did incorporating Batch Normalization yield an improvement in validation accuracy and Macro F1 over No Normalization and LRN? (Yes / No). If Yes: Explain the underlying mathematical and optimization reasons. How does normalizing mini-batch activations reduce internal covariate shift and smooth the optimization landscape? If </w:t>
+      </w:r>
+      <w:proofErr w:type="gramStart"/>
+      <w:r>
+        <w:t>No</w:t>
+      </w:r>
+      <w:proofErr w:type="gramEnd"/>
+      <w:r>
+        <w:t xml:space="preserve"> or Marginal: Discuss what experimental parameters (e.g., choice of learning rate, batch size, or short 10-epoch horizon) may have limited the observable gains.</w:t>
+      </w:r>
     </w:p>
     <w:p>
       <w:pPr>
@@ -2400,11 +2953,19 @@
           <w:sz w:val="22"/>
         </w:rPr>
       </w:pPr>
+      <w:proofErr w:type="spellStart"/>
       <w:r>
         <w:rPr>
           <w:sz w:val="22"/>
         </w:rPr>
-        <w:t>BatchNorm improved both validation metrics: 79.62% accuracy and 79.40% macro F1, versus 72.89% / 72.82% for</w:t>
+        <w:t>BatchNorm</w:t>
+      </w:r>
+      <w:proofErr w:type="spellEnd"/>
+      <w:r>
+        <w:rPr>
+          <w:sz w:val="22"/>
+        </w:rPr>
+        <w:t xml:space="preserve"> improved both validation metrics: 79.62% accuracy and 79.40% macro F1, versus 72.89% / 72.82% for</w:t>
       </w:r>
     </w:p>
     <w:p>
@@ -2424,7 +2985,51 @@
         <w:rPr>
           <w:sz w:val="22"/>
         </w:rPr>
-        <w:t>no normalization and 73.24% / 73.38% for LRN. The improvements were +6.73 percentage points accuracy and</w:t>
+        <w:t>no normalization and 73.24% / 73.38% for LRN.  Final validation loss was</w:t>
+      </w:r>
+      <w:r>
+        <w:rPr>
+          <w:sz w:val="22"/>
+        </w:rPr>
+        <w:t xml:space="preserve"> </w:t>
+      </w:r>
+      <w:r>
+        <w:rPr>
+          <w:sz w:val="22"/>
+        </w:rPr>
+        <w:t>0.5826</w:t>
+      </w:r>
+      <w:r>
+        <w:rPr>
+          <w:sz w:val="22"/>
+        </w:rPr>
+        <w:t xml:space="preserve"> </w:t>
+      </w:r>
+      <w:r>
+        <w:rPr>
+          <w:sz w:val="22"/>
+        </w:rPr>
+        <w:t xml:space="preserve">with </w:t>
+      </w:r>
+      <w:proofErr w:type="spellStart"/>
+      <w:r>
+        <w:rPr>
+          <w:sz w:val="22"/>
+        </w:rPr>
+        <w:t>BatchNorm</w:t>
+      </w:r>
+      <w:proofErr w:type="spellEnd"/>
+      <w:r>
+        <w:rPr>
+          <w:sz w:val="22"/>
+        </w:rPr>
+        <w:t>, compared wit</w:t>
+      </w:r>
+      <w:r>
+        <w:rPr>
+          <w:sz w:val="22"/>
+        </w:rPr>
+        <w:t>h</w:t>
       </w:r>
     </w:p>
     <w:p>
@@ -2444,7 +3049,31 @@
         <w:rPr>
           <w:sz w:val="22"/>
         </w:rPr>
-        <w:t>+6.58 points F1 relative to none, and +6.38 points accuracy and +6.02 points F1 relative to LRN. LRN exceeded no</w:t>
+        <w:t>0.7846 for LRN and 0.7994 without normalization. This lower loss is</w:t>
+      </w:r>
+      <w:r>
+        <w:rPr>
+          <w:sz w:val="22"/>
+        </w:rPr>
+        <w:t xml:space="preserve"> c</w:t>
+      </w:r>
+      <w:r>
+        <w:rPr>
+          <w:sz w:val="22"/>
+        </w:rPr>
+        <w:t>onsistent</w:t>
+      </w:r>
+      <w:r>
+        <w:rPr>
+          <w:sz w:val="22"/>
+        </w:rPr>
+        <w:t xml:space="preserve"> </w:t>
+      </w:r>
+      <w:r>
+        <w:rPr>
+          <w:sz w:val="22"/>
+        </w:rPr>
+        <w:t>with more effective optimization; it</w:t>
       </w:r>
     </w:p>
     <w:p>
@@ -2464,337 +3093,31 @@
         <w:rPr>
           <w:sz w:val="22"/>
         </w:rPr>
-        <w:t>normalization by only +0.35 points accuracy and +0.56 points F1.Loss and stability: Final validation loss was 0.5826</w:t>
-      </w:r>
-    </w:p>
-    <w:p>
-      <w:pPr>
-        <w:pStyle w:val="ListBullet"/>
-        <w:numPr>
-          <w:ilvl w:val="0"/>
-          <w:numId w:val="0"/>
-        </w:numPr>
-        <w:spacing w:after="40"/>
-        <w:ind w:left="360" w:hanging="360"/>
+        <w:t>does not by itself prove smoother epoch-to-epoch trajectories or</w:t>
+      </w:r>
+      <w:r>
         <w:rPr>
           <w:sz w:val="22"/>
         </w:rPr>
-      </w:pPr>
+        <w:t xml:space="preserve"> </w:t>
+      </w:r>
       <w:r>
         <w:rPr>
           <w:sz w:val="22"/>
         </w:rPr>
-        <w:t>with BatchNorm, compared with 0.7846 for LRN and 0.7994 without normalization. This lower loss is consistent</w:t>
-      </w:r>
-    </w:p>
-    <w:p>
-      <w:pPr>
-        <w:pStyle w:val="ListBullet"/>
-        <w:numPr>
-          <w:ilvl w:val="0"/>
-          <w:numId w:val="0"/>
-        </w:numPr>
-        <w:spacing w:after="40"/>
-        <w:ind w:left="360" w:hanging="360"/>
+        <w:t>more stable</w:t>
+      </w:r>
+      <w:r>
         <w:rPr>
           <w:sz w:val="22"/>
         </w:rPr>
-      </w:pPr>
+        <w:t xml:space="preserve"> </w:t>
+      </w:r>
       <w:r>
         <w:rPr>
           <w:sz w:val="22"/>
         </w:rPr>
-        <w:t>with more effective optimization; it does not by itself prove smoother epoch-to-epoch trajectories or more stable</w:t>
-      </w:r>
-    </w:p>
-    <w:p>
-      <w:pPr>
-        <w:pStyle w:val="ListBullet"/>
-        <w:numPr>
-          <w:ilvl w:val="0"/>
-          <w:numId w:val="0"/>
-        </w:numPr>
-        <w:spacing w:after="40"/>
-        <w:ind w:left="360" w:hanging="360"/>
-        <w:rPr>
-          <w:sz w:val="22"/>
-        </w:rPr>
-      </w:pPr>
-      <w:r>
-        <w:rPr>
-          <w:sz w:val="22"/>
-        </w:rPr>
-        <w:t>gradients. The provided results are single-seed (42) runs, so run-to-run stability and loss variance across repeated</w:t>
-      </w:r>
-    </w:p>
-    <w:p>
-      <w:pPr>
-        <w:pStyle w:val="ListBullet"/>
-        <w:numPr>
-          <w:ilvl w:val="0"/>
-          <w:numId w:val="0"/>
-        </w:numPr>
-        <w:spacing w:after="40"/>
-        <w:ind w:left="360" w:hanging="360"/>
-        <w:rPr>
-          <w:sz w:val="22"/>
-        </w:rPr>
-      </w:pPr>
-      <w:r>
-        <w:rPr>
-          <w:sz w:val="22"/>
-        </w:rPr>
-        <w:t>trainings have not been measured.</w:t>
-      </w:r>
-    </w:p>
-    <w:p>
-      <w:pPr>
-        <w:pStyle w:val="Heading3"/>
-        <w:rPr>
-          <w:sz w:val="22"/>
-        </w:rPr>
-      </w:pPr>
-      <w:r>
-        <w:rPr>
-          <w:sz w:val="22"/>
-        </w:rPr>
-        <w:lastRenderedPageBreak/>
-        <w:t>Computational Overhead: Did the addition of LRN or BatchNorm2d measurably alter your training poch wall-clock time and arithmetic FLOPs? (Yes / No). Contrast the computational overhead of element-wise normalization against the convergence benefit.</w:t>
-      </w:r>
-    </w:p>
-    <w:p>
-      <w:pPr>
-        <w:pStyle w:val="ListBullet"/>
-        <w:numPr>
-          <w:ilvl w:val="0"/>
-          <w:numId w:val="0"/>
-        </w:numPr>
-        <w:spacing w:after="40"/>
-        <w:ind w:left="360" w:hanging="360"/>
-        <w:rPr>
-          <w:sz w:val="22"/>
-        </w:rPr>
-      </w:pPr>
-    </w:p>
-    <w:p>
-      <w:pPr>
-        <w:pStyle w:val="ListBullet"/>
-        <w:numPr>
-          <w:ilvl w:val="0"/>
-          <w:numId w:val="0"/>
-        </w:numPr>
-        <w:spacing w:after="40"/>
-        <w:ind w:left="360" w:hanging="360"/>
-        <w:rPr>
-          <w:sz w:val="22"/>
-        </w:rPr>
-      </w:pPr>
-      <w:r>
-        <w:rPr>
-          <w:sz w:val="22"/>
-        </w:rPr>
-        <w:t>Computational cost: Mean epoch times were 215.54 s (none), 249.33 s (LRN), and 208.41 s (BatchNorm). LRN took</w:t>
-      </w:r>
-    </w:p>
-    <w:p>
-      <w:pPr>
-        <w:pStyle w:val="ListBullet"/>
-        <w:numPr>
-          <w:ilvl w:val="0"/>
-          <w:numId w:val="0"/>
-        </w:numPr>
-        <w:spacing w:after="40"/>
-        <w:ind w:left="360" w:hanging="360"/>
-        <w:rPr>
-          <w:sz w:val="22"/>
-        </w:rPr>
-      </w:pPr>
-      <w:r>
-        <w:rPr>
-          <w:sz w:val="22"/>
-        </w:rPr>
-        <w:t>about 15.7% longer than none, while BatchNorm took about 3.3% less time. Reported FLOPs were 436.70M</w:t>
-      </w:r>
-    </w:p>
-    <w:p>
-      <w:pPr>
-        <w:pStyle w:val="ListBullet"/>
-        <w:numPr>
-          <w:ilvl w:val="0"/>
-          <w:numId w:val="0"/>
-        </w:numPr>
-        <w:spacing w:after="40"/>
-        <w:ind w:left="360" w:hanging="360"/>
-        <w:rPr>
-          <w:sz w:val="22"/>
-        </w:rPr>
-      </w:pPr>
-      <w:r>
-        <w:rPr>
-          <w:sz w:val="22"/>
-        </w:rPr>
-        <w:t>(none), 436.70M (LRN), and 437.97M (BatchNorm). Normalization operates on activations without changing</w:t>
-      </w:r>
-    </w:p>
-    <w:p>
-      <w:pPr>
-        <w:pStyle w:val="ListBullet"/>
-        <w:numPr>
-          <w:ilvl w:val="0"/>
-          <w:numId w:val="0"/>
-        </w:numPr>
-        <w:spacing w:after="40"/>
-        <w:ind w:left="360" w:hanging="360"/>
-        <w:rPr>
-          <w:sz w:val="22"/>
-        </w:rPr>
-      </w:pPr>
-      <w:r>
-        <w:rPr>
-          <w:sz w:val="22"/>
-        </w:rPr>
-        <w:t>convolution output shapes; BatchNorm adds channel-wise affine parameters and operations. FLOP estimates may</w:t>
-      </w:r>
-    </w:p>
-    <w:p>
-      <w:pPr>
-        <w:pStyle w:val="ListBullet"/>
-        <w:numPr>
-          <w:ilvl w:val="0"/>
-          <w:numId w:val="0"/>
-        </w:numPr>
-        <w:spacing w:after="40"/>
-        <w:ind w:left="360" w:hanging="360"/>
-        <w:rPr>
-          <w:sz w:val="22"/>
-        </w:rPr>
-      </w:pPr>
-      <w:r>
-        <w:rPr>
-          <w:sz w:val="22"/>
-        </w:rPr>
-        <w:t>omit or approximate some normalization operations, especially LRN. CPU wall-clock time also depends on kernel</w:t>
-      </w:r>
-    </w:p>
-    <w:p>
-      <w:pPr>
-        <w:pStyle w:val="ListBullet"/>
-        <w:numPr>
-          <w:ilvl w:val="0"/>
-          <w:numId w:val="0"/>
-        </w:numPr>
-        <w:spacing w:after="40"/>
-        <w:ind w:left="360" w:hanging="360"/>
-        <w:rPr>
-          <w:sz w:val="22"/>
-        </w:rPr>
-      </w:pPr>
-      <w:r>
-        <w:rPr>
-          <w:sz w:val="22"/>
-        </w:rPr>
-        <w:t>implementation, memory access, data loading, and hardware, so FLOPs alone do not predict runtime.</w:t>
-      </w:r>
-    </w:p>
-    <w:p>
-      <w:pPr>
-        <w:pStyle w:val="Heading3"/>
-        <w:rPr>
-          <w:sz w:val="22"/>
-        </w:rPr>
-      </w:pPr>
-      <w:r>
-        <w:rPr>
-          <w:sz w:val="22"/>
-        </w:rPr>
-        <w:t>Convergence Stability: Compare the variance and smoothness of the training loss trajectories across the three variants. Which normalization scheme demonstrated the most stable gradient progression?</w:t>
-      </w:r>
-    </w:p>
-    <w:p>
-      <w:pPr>
-        <w:rPr>
-          <w:sz w:val="22"/>
-        </w:rPr>
-      </w:pPr>
-    </w:p>
-    <w:p>
-      <w:pPr>
-        <w:pStyle w:val="ListBullet"/>
-        <w:numPr>
-          <w:ilvl w:val="0"/>
-          <w:numId w:val="0"/>
-        </w:numPr>
-        <w:spacing w:after="40"/>
-        <w:ind w:left="360" w:hanging="360"/>
-        <w:rPr>
-          <w:sz w:val="22"/>
-        </w:rPr>
-      </w:pPr>
-      <w:r>
-        <w:rPr>
-          <w:sz w:val="22"/>
-        </w:rPr>
-        <w:t>Interpretation of small differences: The marginal LRN advantage could reflect the short 10-epoch horizon, learning</w:t>
-      </w:r>
-    </w:p>
-    <w:p>
-      <w:pPr>
-        <w:pStyle w:val="ListBullet"/>
-        <w:numPr>
-          <w:ilvl w:val="0"/>
-          <w:numId w:val="0"/>
-        </w:numPr>
-        <w:spacing w:after="40"/>
-        <w:ind w:left="360" w:hanging="360"/>
-        <w:rPr>
-          <w:sz w:val="22"/>
-        </w:rPr>
-      </w:pPr>
-      <w:r>
-        <w:rPr>
-          <w:sz w:val="22"/>
-        </w:rPr>
-        <w:t>rate 0.001, batch size 128, and stochastic training variation. Although seed 42 was held fixed, one seed cannot</w:t>
-      </w:r>
-    </w:p>
-    <w:p>
-      <w:pPr>
-        <w:pStyle w:val="ListBullet"/>
-        <w:numPr>
-          <w:ilvl w:val="0"/>
-          <w:numId w:val="0"/>
-        </w:numPr>
-        <w:spacing w:after="40"/>
-        <w:ind w:left="360" w:hanging="360"/>
-        <w:rPr>
-          <w:sz w:val="22"/>
-        </w:rPr>
-      </w:pPr>
-      <w:r>
-        <w:rPr>
-          <w:sz w:val="22"/>
-        </w:rPr>
-        <w:t>establish a reliable average benefit. Repeated runs with multiple seeds and reporting mean ± standard deviation</w:t>
-      </w:r>
-    </w:p>
-    <w:p>
-      <w:pPr>
-        <w:pStyle w:val="ListBullet"/>
-        <w:numPr>
-          <w:ilvl w:val="0"/>
-          <w:numId w:val="0"/>
-        </w:numPr>
-        <w:spacing w:after="40"/>
-        <w:ind w:left="360" w:hanging="360"/>
-        <w:rPr>
-          <w:sz w:val="22"/>
-        </w:rPr>
-      </w:pPr>
-      <w:r>
-        <w:rPr>
-          <w:sz w:val="22"/>
-        </w:rPr>
-        <w:t>would better establish reproducibility.</w:t>
+        <w:t xml:space="preserve">gradients. </w:t>
       </w:r>
     </w:p>
     <w:p>
@@ -2802,12 +3125,203 @@
         <w:pStyle w:val="Heading2"/>
       </w:pPr>
       <w:r>
-        <w:t>Generalization gap</w:t>
+        <w:lastRenderedPageBreak/>
+        <w:t xml:space="preserve">Computational Overhead: Did the addition of LRN or BatchNorm2d measurably alter your training </w:t>
+      </w:r>
+      <w:proofErr w:type="spellStart"/>
+      <w:r>
+        <w:t>poch</w:t>
+      </w:r>
+      <w:proofErr w:type="spellEnd"/>
+      <w:r>
+        <w:t xml:space="preserve"> wall-clock time and arithmetic FLOPs? (Yes / No). Contrast the computational overhead of element-wise normalization against the convergence benefit.</w:t>
+      </w:r>
+    </w:p>
+    <w:p>
+      <w:pPr>
+        <w:pStyle w:val="Heading2"/>
+        <w:rPr>
+          <w:rFonts w:ascii="Calibri" w:eastAsiaTheme="minorEastAsia" w:hAnsi="Calibri" w:cstheme="minorBidi"/>
+          <w:b w:val="0"/>
+          <w:bCs w:val="0"/>
+          <w:color w:val="auto"/>
+          <w:sz w:val="22"/>
+          <w:szCs w:val="22"/>
+        </w:rPr>
+      </w:pPr>
+      <w:r>
+        <w:rPr>
+          <w:rFonts w:ascii="Calibri" w:eastAsiaTheme="minorEastAsia" w:hAnsi="Calibri" w:cstheme="minorBidi"/>
+          <w:b w:val="0"/>
+          <w:bCs w:val="0"/>
+          <w:color w:val="auto"/>
+          <w:sz w:val="22"/>
+          <w:szCs w:val="22"/>
+        </w:rPr>
+        <w:t xml:space="preserve">Yes. LRN increased the average training time per epoch, while </w:t>
+      </w:r>
+      <w:proofErr w:type="spellStart"/>
+      <w:r>
+        <w:rPr>
+          <w:rFonts w:ascii="Calibri" w:eastAsiaTheme="minorEastAsia" w:hAnsi="Calibri" w:cstheme="minorBidi"/>
+          <w:b w:val="0"/>
+          <w:bCs w:val="0"/>
+          <w:color w:val="auto"/>
+          <w:sz w:val="22"/>
+          <w:szCs w:val="22"/>
+        </w:rPr>
+        <w:t>BatchNorm</w:t>
+      </w:r>
+      <w:proofErr w:type="spellEnd"/>
+      <w:r>
+        <w:rPr>
+          <w:rFonts w:ascii="Calibri" w:eastAsiaTheme="minorEastAsia" w:hAnsi="Calibri" w:cstheme="minorBidi"/>
+          <w:b w:val="0"/>
+          <w:bCs w:val="0"/>
+          <w:color w:val="auto"/>
+          <w:sz w:val="22"/>
+          <w:szCs w:val="22"/>
+        </w:rPr>
+        <w:t xml:space="preserve"> was slightly faster than the model without normalization. The average epoch times were 215.54 seconds without normalization, 249.33 seconds with LRN, and 208.41 seconds with </w:t>
+      </w:r>
+      <w:proofErr w:type="spellStart"/>
+      <w:r>
+        <w:rPr>
+          <w:rFonts w:ascii="Calibri" w:eastAsiaTheme="minorEastAsia" w:hAnsi="Calibri" w:cstheme="minorBidi"/>
+          <w:b w:val="0"/>
+          <w:bCs w:val="0"/>
+          <w:color w:val="auto"/>
+          <w:sz w:val="22"/>
+          <w:szCs w:val="22"/>
+        </w:rPr>
+        <w:t>BatchNorm</w:t>
+      </w:r>
+      <w:proofErr w:type="spellEnd"/>
+      <w:r>
+        <w:rPr>
+          <w:rFonts w:ascii="Calibri" w:eastAsiaTheme="minorEastAsia" w:hAnsi="Calibri" w:cstheme="minorBidi"/>
+          <w:b w:val="0"/>
+          <w:bCs w:val="0"/>
+          <w:color w:val="auto"/>
+          <w:sz w:val="22"/>
+          <w:szCs w:val="22"/>
+        </w:rPr>
+        <w:t>.</w:t>
+      </w:r>
+      <w:r>
+        <w:rPr>
+          <w:rFonts w:ascii="Calibri" w:eastAsiaTheme="minorEastAsia" w:hAnsi="Calibri" w:cstheme="minorBidi"/>
+          <w:b w:val="0"/>
+          <w:bCs w:val="0"/>
+          <w:color w:val="auto"/>
+          <w:sz w:val="22"/>
+          <w:szCs w:val="22"/>
+        </w:rPr>
+        <w:t xml:space="preserve"> </w:t>
+      </w:r>
+      <w:r>
+        <w:rPr>
+          <w:rFonts w:ascii="Calibri" w:eastAsiaTheme="minorEastAsia" w:hAnsi="Calibri" w:cstheme="minorBidi"/>
+          <w:b w:val="0"/>
+          <w:bCs w:val="0"/>
+          <w:color w:val="auto"/>
+          <w:sz w:val="22"/>
+          <w:szCs w:val="22"/>
+        </w:rPr>
+        <w:t xml:space="preserve">The reported FLOPs were 436.70M for both no normalization and LRN, compared to 437.97M for </w:t>
+      </w:r>
+      <w:proofErr w:type="spellStart"/>
+      <w:r>
+        <w:rPr>
+          <w:rFonts w:ascii="Calibri" w:eastAsiaTheme="minorEastAsia" w:hAnsi="Calibri" w:cstheme="minorBidi"/>
+          <w:b w:val="0"/>
+          <w:bCs w:val="0"/>
+          <w:color w:val="auto"/>
+          <w:sz w:val="22"/>
+          <w:szCs w:val="22"/>
+        </w:rPr>
+        <w:t>BatchNorm</w:t>
+      </w:r>
+      <w:proofErr w:type="spellEnd"/>
+      <w:r>
+        <w:rPr>
+          <w:rFonts w:ascii="Calibri" w:eastAsiaTheme="minorEastAsia" w:hAnsi="Calibri" w:cstheme="minorBidi"/>
+          <w:b w:val="0"/>
+          <w:bCs w:val="0"/>
+          <w:color w:val="auto"/>
+          <w:sz w:val="22"/>
+          <w:szCs w:val="22"/>
+        </w:rPr>
+        <w:t xml:space="preserve">. This shows that </w:t>
+      </w:r>
+      <w:proofErr w:type="spellStart"/>
+      <w:r>
+        <w:rPr>
+          <w:rFonts w:ascii="Calibri" w:eastAsiaTheme="minorEastAsia" w:hAnsi="Calibri" w:cstheme="minorBidi"/>
+          <w:b w:val="0"/>
+          <w:bCs w:val="0"/>
+          <w:color w:val="auto"/>
+          <w:sz w:val="22"/>
+          <w:szCs w:val="22"/>
+        </w:rPr>
+        <w:t>BatchNorm</w:t>
+      </w:r>
+      <w:proofErr w:type="spellEnd"/>
+      <w:r>
+        <w:rPr>
+          <w:rFonts w:ascii="Calibri" w:eastAsiaTheme="minorEastAsia" w:hAnsi="Calibri" w:cstheme="minorBidi"/>
+          <w:b w:val="0"/>
+          <w:bCs w:val="0"/>
+          <w:color w:val="auto"/>
+          <w:sz w:val="22"/>
+          <w:szCs w:val="22"/>
+        </w:rPr>
+        <w:t xml:space="preserve"> added a small amount of computational complexity, but the increase was minimal compared to the improvement in validation accuracy.</w:t>
+      </w:r>
+      <w:r>
+        <w:rPr>
+          <w:rFonts w:ascii="Calibri" w:eastAsiaTheme="minorEastAsia" w:hAnsi="Calibri" w:cstheme="minorBidi"/>
+          <w:b w:val="0"/>
+          <w:bCs w:val="0"/>
+          <w:color w:val="auto"/>
+          <w:sz w:val="22"/>
+          <w:szCs w:val="22"/>
+        </w:rPr>
+        <w:t xml:space="preserve"> </w:t>
+      </w:r>
+      <w:r>
+        <w:rPr>
+          <w:rFonts w:ascii="Calibri" w:eastAsiaTheme="minorEastAsia" w:hAnsi="Calibri" w:cstheme="minorBidi"/>
+          <w:b w:val="0"/>
+          <w:bCs w:val="0"/>
+          <w:color w:val="auto"/>
+          <w:sz w:val="22"/>
+          <w:szCs w:val="22"/>
+        </w:rPr>
+        <w:t>Although LRN had the same reported FLOPs as no normalization, it took longer to train. This is because FLOP estimates do not always account for all normalization operations, and training time also depends on how efficiently those operations run on the hardware.</w:t>
+      </w:r>
+    </w:p>
+    <w:p>
+      <w:pPr>
+        <w:pStyle w:val="Heading2"/>
+        <w:rPr>
+          <w:rFonts w:ascii="Calibri" w:eastAsiaTheme="minorEastAsia" w:hAnsi="Calibri" w:cstheme="minorBidi"/>
+          <w:b w:val="0"/>
+          <w:bCs w:val="0"/>
+          <w:color w:val="auto"/>
+          <w:sz w:val="22"/>
+          <w:szCs w:val="22"/>
+        </w:rPr>
+      </w:pPr>
+      <w:r>
+        <w:t>Convergence Stability: Compare the variance and smoothness of the training loss trajectories across the three variants. Which normalization scheme demonstrated the most stable gradient progression?</w:t>
       </w:r>
     </w:p>
     <w:p>
       <w:pPr>
         <w:rPr>
+          <w:b/>
+          <w:bCs/>
           <w:sz w:val="22"/>
         </w:rPr>
       </w:pPr>
@@ -2815,8 +3329,76 @@
         <w:rPr>
           <w:sz w:val="22"/>
         </w:rPr>
-        <w:t>Calculate Δ = training accuracy − validation accuracy, using the same accuracy scale for both values (percentage points if accuracies are percentages).</w:t>
-      </w:r>
+        <w:t xml:space="preserve">BatchNorm had the lowest final validation loss (0.5826) and highest validation accuracy (79.62%), suggesting better convergence than LRN or no normalization. Its loss curve generally decreased, although the validation curve still fluctuated. These curves do not measure gradient variance directly, so they support better observed convergence rather than proving the most stable gradients. </w:t>
+      </w:r>
+    </w:p>
+    <w:p>
+      <w:pPr>
+        <w:pStyle w:val="Heading2"/>
+        <w:rPr>
+          <w:rFonts w:ascii="Calibri" w:eastAsiaTheme="minorEastAsia" w:hAnsi="Calibri" w:cstheme="minorBidi"/>
+          <w:b w:val="0"/>
+          <w:bCs w:val="0"/>
+          <w:color w:val="auto"/>
+          <w:sz w:val="22"/>
+          <w:szCs w:val="22"/>
+        </w:rPr>
+      </w:pPr>
+      <w:r>
+        <w:t>Generalization gap</w:t>
+      </w:r>
+    </w:p>
+    <w:p>
+      <w:pPr>
+        <w:pStyle w:val="Caption"/>
+        <w:rPr>
+          <w:b w:val="0"/>
+          <w:bCs w:val="0"/>
+          <w:color w:val="auto"/>
+          <w:sz w:val="22"/>
+          <w:szCs w:val="22"/>
+        </w:rPr>
+      </w:pPr>
+      <w:r>
+        <w:t xml:space="preserve">Table </w:t>
+      </w:r>
+      <w:r>
+        <w:fldChar w:fldCharType="begin"/>
+      </w:r>
+      <w:r>
+        <w:instrText xml:space="preserve"> SEQ Table \* ARABIC </w:instrText>
+      </w:r>
+      <w:r>
+        <w:fldChar w:fldCharType="separate"/>
+      </w:r>
+      <w:r>
+        <w:rPr>
+          <w:noProof/>
+        </w:rPr>
+        <w:t>5</w:t>
+      </w:r>
+      <w:r>
+        <w:fldChar w:fldCharType="end"/>
+      </w:r>
+      <w:r>
+        <w:t xml:space="preserve">: </w:t>
+      </w:r>
+      <w:r>
+        <w:t xml:space="preserve">Comparison of Training Performance and Generalization Gap for </w:t>
+      </w:r>
+      <w:proofErr w:type="spellStart"/>
+      <w:r>
+        <w:t>AlexNet</w:t>
+      </w:r>
+      <w:proofErr w:type="spellEnd"/>
+      <w:r>
+        <w:t xml:space="preserve"> with </w:t>
+      </w:r>
+      <w:proofErr w:type="spellStart"/>
+      <w:r>
+        <w:t>BatchNorm</w:t>
+      </w:r>
+      <w:proofErr w:type="spellEnd"/>
     </w:p>
     <w:tbl>
       <w:tblPr>
@@ -2870,13 +3452,23 @@
                 <w:sz w:val="22"/>
               </w:rPr>
             </w:pPr>
+            <w:proofErr w:type="spellStart"/>
             <w:r>
               <w:rPr>
                 <w:b/>
                 <w:color w:val="FFFFFF"/>
                 <w:sz w:val="22"/>
               </w:rPr>
-              <w:t>BatchNorm, no augmentation</w:t>
+              <w:t>BatchNorm</w:t>
+            </w:r>
+            <w:proofErr w:type="spellEnd"/>
+            <w:r>
+              <w:rPr>
+                <w:b/>
+                <w:color w:val="FFFFFF"/>
+                <w:sz w:val="22"/>
+              </w:rPr>
+              <w:t>, no augmentation</w:t>
             </w:r>
           </w:p>
         </w:tc>
@@ -2893,13 +3485,23 @@
                 <w:sz w:val="22"/>
               </w:rPr>
             </w:pPr>
+            <w:proofErr w:type="spellStart"/>
             <w:r>
               <w:rPr>
                 <w:b/>
                 <w:color w:val="FFFFFF"/>
                 <w:sz w:val="22"/>
               </w:rPr>
-              <w:t>BatchNorm + augmentation</w:t>
+              <w:t>BatchNorm</w:t>
+            </w:r>
+            <w:proofErr w:type="spellEnd"/>
+            <w:r>
+              <w:rPr>
+                <w:b/>
+                <w:color w:val="FFFFFF"/>
+                <w:sz w:val="22"/>
+              </w:rPr>
+              <w:t xml:space="preserve"> + augmentation</w:t>
             </w:r>
           </w:p>
         </w:tc>
@@ -3306,70 +3908,14 @@
     </w:tbl>
     <w:p>
       <w:pPr>
-        <w:pStyle w:val="Heading3"/>
-      </w:pPr>
-      <w:r>
         <w:rPr>
+          <w:rFonts w:asciiTheme="majorHAnsi" w:eastAsiaTheme="majorEastAsia" w:hAnsiTheme="majorHAnsi" w:cstheme="majorBidi"/>
           <w:b/>
-          <w:color w:val="204670"/>
-        </w:rPr>
-        <w:t>Generalization Gap Reduction — Yes</w:t>
-      </w:r>
-    </w:p>
-    <w:p>
-      <w:pPr/>
-      <w:r>
-        <w:rPr>
-          <w:sz w:val="20"/>
-        </w:rPr>
-        <w:t>At epoch 15, without augmentation, training accuracy was 90.34% and validation accuracy was 81.66%, giving Δ = 90.34 − 81.66 = 8.68 percentage points. With augmentation, training accuracy was 84.66% and validation accuracy was 81.95%, giving Δ = 84.66 − 81.95 = 2.71 percentage points. Augmentation therefore reduced the gap by 5.97 percentage points (approximately 68.8%). The lower training accuracy and smaller gap are consistent with stronger regularization and reduced overfitting.</w:t>
-      </w:r>
-    </w:p>
-    <w:p>
-      <w:pPr>
-        <w:pStyle w:val="Heading3"/>
-      </w:pPr>
-      <w:r>
-        <w:rPr>
-          <w:b/>
-          <w:color w:val="204670"/>
-        </w:rPr>
-        <w:t>Validation Metric Improvement — Yes (marginal)</w:t>
-      </w:r>
-    </w:p>
-    <w:p>
-      <w:pPr/>
-      <w:r>
-        <w:rPr>
-          <w:sz w:val="20"/>
-        </w:rPr>
-        <w:t>Final validation accuracy increased from 81.66% without augmentation to 81.95% with augmentation (+0.29 percentage points), while macro F1 increased from 81.82% to 82.21% (+0.39 percentage points). Random crops, horizontal flips, and color jitter create label-preserving variation that encourages convolutional filters to recognize semantic patterns across changes in object position, orientation, and appearance instead of memorizing specific training-image configurations.</w:t>
-      </w:r>
-    </w:p>
-    <w:p>
-      <w:pPr/>
-      <w:r>
-        <w:rPr>
-          <w:sz w:val="20"/>
-        </w:rPr>
-        <w:t>The improvements in final validation metrics were modest, even though the generalization gap decreased substantially. The augmented model reached a higher best validation accuracy of 83.50% at epoch 14, before finishing at 81.95% at epoch 15, indicating validation fluctuations. Additional training might help the model assimilate the augmented distribution, but the current results do not establish that more epochs are required or that transformations caused underfitting.</w:t>
-      </w:r>
-    </w:p>
-    <w:p>
-      <w:pPr>
-        <w:pStyle w:val="Heading1"/>
-        <w:rPr>
-          <w:sz w:val="24"/>
-          <w:szCs w:val="24"/>
+          <w:bCs/>
+          <w:color w:val="2F5597"/>
+          <w:sz w:val="22"/>
         </w:rPr>
       </w:pPr>
-      <w:r>
-        <w:rPr>
-          <w:sz w:val="24"/>
-          <w:szCs w:val="24"/>
-        </w:rPr>
-        <w:t>Dual-Dataset Evaluation: CIFAR-10 and Tiny ImageNet</w:t>
-      </w:r>
     </w:p>
     <w:p>
       <w:pPr>
@@ -3377,6 +3923,237 @@
           <w:sz w:val="22"/>
         </w:rPr>
       </w:pPr>
+      <w:r>
+        <w:rPr>
+          <w:sz w:val="22"/>
+        </w:rPr>
+        <w:t>The generalization gap was calculated by subtracting validation accuracy from training accuracy. Without augmentation, the model had a gap of 8.68 percentage points, compared to only 2.71 percentage points with augmentation.</w:t>
+      </w:r>
+      <w:r>
+        <w:rPr>
+          <w:sz w:val="22"/>
+        </w:rPr>
+        <w:t xml:space="preserve"> </w:t>
+      </w:r>
+      <w:r>
+        <w:rPr>
+          <w:sz w:val="22"/>
+        </w:rPr>
+        <w:t>This shows that data augmentation reduced the generalization gap by 5.97 percentage points. The model without augmentation achieved a higher training accuracy (90.34%), but both models had similar validation accuracy. This suggests that the model without augmentation was fitting the training data more closely without performing much better on unseen images.</w:t>
+      </w:r>
+    </w:p>
+    <w:p>
+      <w:pPr>
+        <w:rPr>
+          <w:rFonts w:asciiTheme="majorHAnsi" w:eastAsiaTheme="majorEastAsia" w:hAnsiTheme="majorHAnsi" w:cstheme="majorBidi"/>
+          <w:b/>
+          <w:bCs/>
+          <w:color w:val="2F5597"/>
+          <w:sz w:val="24"/>
+          <w:szCs w:val="26"/>
+        </w:rPr>
+      </w:pPr>
+      <w:r>
+        <w:rPr>
+          <w:rFonts w:asciiTheme="majorHAnsi" w:eastAsiaTheme="majorEastAsia" w:hAnsiTheme="majorHAnsi" w:cstheme="majorBidi"/>
+          <w:b/>
+          <w:bCs/>
+          <w:color w:val="2F5597"/>
+          <w:sz w:val="24"/>
+          <w:szCs w:val="26"/>
+        </w:rPr>
+        <w:t xml:space="preserve">Generalization Gap Reduction: Did applying the </w:t>
+      </w:r>
+      <w:proofErr w:type="spellStart"/>
+      <w:r>
+        <w:rPr>
+          <w:rFonts w:asciiTheme="majorHAnsi" w:eastAsiaTheme="majorEastAsia" w:hAnsiTheme="majorHAnsi" w:cstheme="majorBidi"/>
+          <w:b/>
+          <w:bCs/>
+          <w:color w:val="2F5597"/>
+          <w:sz w:val="24"/>
+          <w:szCs w:val="26"/>
+        </w:rPr>
+        <w:t>PyTorch</w:t>
+      </w:r>
+      <w:proofErr w:type="spellEnd"/>
+      <w:r>
+        <w:rPr>
+          <w:rFonts w:asciiTheme="majorHAnsi" w:eastAsiaTheme="majorEastAsia" w:hAnsiTheme="majorHAnsi" w:cstheme="majorBidi"/>
+          <w:b/>
+          <w:bCs/>
+          <w:color w:val="2F5597"/>
+          <w:sz w:val="24"/>
+          <w:szCs w:val="26"/>
+        </w:rPr>
+        <w:t xml:space="preserve"> data augmentation pipeline reduce the</w:t>
+      </w:r>
+      <w:r>
+        <w:rPr>
+          <w:rFonts w:asciiTheme="majorHAnsi" w:eastAsiaTheme="majorEastAsia" w:hAnsiTheme="majorHAnsi" w:cstheme="majorBidi"/>
+          <w:b/>
+          <w:bCs/>
+          <w:color w:val="2F5597"/>
+          <w:sz w:val="24"/>
+          <w:szCs w:val="26"/>
+        </w:rPr>
+        <w:t xml:space="preserve"> </w:t>
+      </w:r>
+      <w:r>
+        <w:rPr>
+          <w:rFonts w:asciiTheme="majorHAnsi" w:eastAsiaTheme="majorEastAsia" w:hAnsiTheme="majorHAnsi" w:cstheme="majorBidi"/>
+          <w:b/>
+          <w:bCs/>
+          <w:color w:val="2F5597"/>
+          <w:sz w:val="24"/>
+          <w:szCs w:val="26"/>
+        </w:rPr>
+        <w:t xml:space="preserve">generalization gap Δ? (Yes / No). </w:t>
+      </w:r>
+    </w:p>
+    <w:p>
+      <w:pPr>
+        <w:rPr>
+          <w:sz w:val="22"/>
+        </w:rPr>
+      </w:pPr>
+      <w:r>
+        <w:rPr>
+          <w:sz w:val="22"/>
+        </w:rPr>
+        <w:t>Yes. Augmentation reduced the generalization gap from 8.68 to 2.71 percen</w:t>
+      </w:r>
+      <w:r>
+        <w:rPr>
+          <w:sz w:val="22"/>
+        </w:rPr>
+        <w:t>t,</w:t>
+      </w:r>
+      <w:r>
+        <w:rPr>
+          <w:sz w:val="22"/>
+        </w:rPr>
+        <w:t xml:space="preserve"> a reduction of 5.97. The augmented model had lower training accuracy but slightly higher validation accuracy, suggesting less </w:t>
+      </w:r>
+      <w:r>
+        <w:rPr>
+          <w:sz w:val="22"/>
+        </w:rPr>
+        <w:t>overfitting. The</w:t>
+      </w:r>
+      <w:r>
+        <w:rPr>
+          <w:sz w:val="22"/>
+        </w:rPr>
+        <w:t xml:space="preserve"> comparison uses the final epoch of both 15-epoch runs, so the accuracy values are measured at the same training duration.</w:t>
+      </w:r>
+    </w:p>
+    <w:p>
+      <w:pPr>
+        <w:pStyle w:val="Heading2"/>
+      </w:pPr>
+      <w:r>
+        <w:lastRenderedPageBreak/>
+        <w:t>Validation Metric Improvement: Did data augmentation lead to an overall increase in final validation</w:t>
+      </w:r>
+      <w:r>
+        <w:t xml:space="preserve"> </w:t>
+      </w:r>
+      <w:r>
+        <w:t xml:space="preserve">accuracy and Macro F1? (Yes / No). </w:t>
+      </w:r>
+    </w:p>
+    <w:p>
+      <w:pPr>
+        <w:rPr>
+          <w:sz w:val="22"/>
+        </w:rPr>
+      </w:pPr>
+      <w:r>
+        <w:rPr>
+          <w:sz w:val="22"/>
+        </w:rPr>
+        <w:t>Yes, but only slightly. With augmentation, final validation accuracy increased from 81.66% to 81.95%, and Macro F1 increased from 81.82% to 82.21%</w:t>
+      </w:r>
+      <w:r>
+        <w:rPr>
+          <w:sz w:val="22"/>
+        </w:rPr>
+        <w:t xml:space="preserve">. </w:t>
+      </w:r>
+      <w:r>
+        <w:rPr>
+          <w:sz w:val="22"/>
+        </w:rPr>
+        <w:t>The larger benefit was the reduced generalization gap, rather than a large increase in final validation performance.</w:t>
+      </w:r>
+    </w:p>
+    <w:p>
+      <w:pPr>
+        <w:pStyle w:val="Heading2"/>
+      </w:pPr>
+      <w:r>
+        <w:t xml:space="preserve">Overfitting Trajectory: Did the Tiny ImageNet validation loss </w:t>
+      </w:r>
+      <w:proofErr w:type="gramStart"/>
+      <w:r>
+        <w:t>diverge</w:t>
+      </w:r>
+      <w:proofErr w:type="gramEnd"/>
+      <w:r>
+        <w:t xml:space="preserve"> or plateau earlier in the training schedule compared to CIFAR-10? Explain this behavior using your generated loss curves.</w:t>
+      </w:r>
+    </w:p>
+    <w:p>
+      <w:pPr>
+        <w:rPr>
+          <w:sz w:val="22"/>
+        </w:rPr>
+      </w:pPr>
+      <w:r>
+        <w:rPr>
+          <w:sz w:val="22"/>
+        </w:rPr>
+        <w:t>Tiny ImageNet was harder to classify, but lower accuracy alone does not show earlier overfitting. The Tiny ImageNet LRN validation loss fell from 4.8865 to 3.3920 across 10 epochs, while the Zoo AlexNet validation loss decreased through epoch 9 (4.2962) before a small rise at epoch 10 (4.3068). The displayed curves do not establish a consistently earlier plateau than CIFAR-10. A direct epoch-by-epoch comparison of matching runs would be needed for that conclusion.</w:t>
+      </w:r>
+    </w:p>
+    <w:p>
+      <w:pPr>
+        <w:pStyle w:val="Heading2"/>
+      </w:pPr>
+      <w:r>
+        <w:t>Dual-Dataset Evaluation: CIFAR-10 and Tiny ImageNet</w:t>
+      </w:r>
+    </w:p>
+    <w:p>
+      <w:pPr>
+        <w:pStyle w:val="Caption"/>
+        <w:keepNext/>
+      </w:pPr>
+      <w:r>
+        <w:t xml:space="preserve">Table </w:t>
+      </w:r>
+      <w:r>
+        <w:fldChar w:fldCharType="begin"/>
+      </w:r>
+      <w:r>
+        <w:instrText xml:space="preserve"> SEQ Table \* ARABIC </w:instrText>
+      </w:r>
+      <w:r>
+        <w:fldChar w:fldCharType="separate"/>
+      </w:r>
+      <w:r>
+        <w:rPr>
+          <w:noProof/>
+        </w:rPr>
+        <w:t>6</w:t>
+      </w:r>
+      <w:r>
+        <w:fldChar w:fldCharType="end"/>
+      </w:r>
+      <w:r>
+        <w:t>: Different parameters between CIFAR-10 and ImageNet data</w:t>
+      </w:r>
     </w:p>
     <w:tbl>
       <w:tblPr>
@@ -3568,7 +4345,15 @@
               </w:rPr>
             </w:pPr>
             <w:r>
-              <w:t>79.62 (10 epochs); 81.95 (15 epochs, aug.)</w:t>
+              <w:t xml:space="preserve">79.62 (10 epochs); 81.95 (15 epochs, </w:t>
+            </w:r>
+            <w:proofErr w:type="spellStart"/>
+            <w:r>
+              <w:t>aug.</w:t>
+            </w:r>
+            <w:proofErr w:type="spellEnd"/>
+            <w:r>
+              <w:t>)</w:t>
             </w:r>
           </w:p>
         </w:tc>
@@ -3631,7 +4416,15 @@
               </w:rPr>
             </w:pPr>
             <w:r>
-              <w:t>79.40 (10 epochs); 82.21 (15 epochs, aug.)</w:t>
+              <w:t xml:space="preserve">79.40 (10 epochs); 82.21 (15 epochs, </w:t>
+            </w:r>
+            <w:proofErr w:type="spellStart"/>
+            <w:r>
+              <w:t>aug.</w:t>
+            </w:r>
+            <w:proofErr w:type="spellEnd"/>
+            <w:r>
+              <w:t>)</w:t>
             </w:r>
           </w:p>
         </w:tc>
@@ -3698,7 +4491,21 @@
               <w:rPr>
                 <w:sz w:val="22"/>
               </w:rPr>
-              <w:t>0.5473 (15 epochs, aug.)</w:t>
+              <w:t xml:space="preserve">0.5473 (15 epochs, </w:t>
+            </w:r>
+            <w:proofErr w:type="spellStart"/>
+            <w:r>
+              <w:rPr>
+                <w:sz w:val="22"/>
+              </w:rPr>
+              <w:t>aug.</w:t>
+            </w:r>
+            <w:proofErr w:type="spellEnd"/>
+            <w:r>
+              <w:rPr>
+                <w:sz w:val="22"/>
+              </w:rPr>
+              <w:t>)</w:t>
             </w:r>
           </w:p>
         </w:tc>
@@ -3862,13 +4669,38 @@
       <w:pPr>
         <w:pStyle w:val="Heading2"/>
       </w:pPr>
+      <w:r>
+        <w:t>Architectural complexity and timing</w:t>
+      </w:r>
     </w:p>
     <w:p>
       <w:pPr>
-        <w:pStyle w:val="Heading2"/>
+        <w:pStyle w:val="Caption"/>
+        <w:keepNext/>
       </w:pPr>
       <w:r>
-        <w:t>Architectural complexity and timing</w:t>
+        <w:t xml:space="preserve">Table </w:t>
+      </w:r>
+      <w:r>
+        <w:fldChar w:fldCharType="begin"/>
+      </w:r>
+      <w:r>
+        <w:instrText xml:space="preserve"> SEQ Table \* ARABIC </w:instrText>
+      </w:r>
+      <w:r>
+        <w:fldChar w:fldCharType="separate"/>
+      </w:r>
+      <w:r>
+        <w:rPr>
+          <w:noProof/>
+        </w:rPr>
+        <w:t>7</w:t>
+      </w:r>
+      <w:r>
+        <w:fldChar w:fldCharType="end"/>
+      </w:r>
+      <w:r>
+        <w:t>: Complexity and timing of the CNN's architectures</w:t>
       </w:r>
     </w:p>
     <w:tbl>
@@ -3934,22 +4766,36 @@
                 <w:color w:val="FFFFFF"/>
                 <w:sz w:val="22"/>
               </w:rPr>
-              <w:t xml:space="preserve">Conv </w:t>
-            </w:r>
+              <w:t>Conv depth</w:t>
+            </w:r>
+          </w:p>
+        </w:tc>
+        <w:tc>
+          <w:tcPr>
+            <w:tcW w:w="2376" w:type="dxa"/>
+            <w:shd w:val="clear" w:color="auto" w:fill="17365D"/>
+            <w:vAlign w:val="center"/>
+          </w:tcPr>
+          <w:p>
+            <w:pPr>
+              <w:spacing w:after="0"/>
+              <w:rPr>
+                <w:sz w:val="22"/>
+              </w:rPr>
+            </w:pPr>
             <w:r>
               <w:rPr>
                 <w:b/>
                 <w:color w:val="FFFFFF"/>
                 <w:sz w:val="22"/>
               </w:rPr>
-              <w:lastRenderedPageBreak/>
-              <w:t>depth</w:t>
-            </w:r>
-          </w:p>
-        </w:tc>
-        <w:tc>
-          <w:tcPr>
-            <w:tcW w:w="2376" w:type="dxa"/>
+              <w:t>Normalization / regularization</w:t>
+            </w:r>
+          </w:p>
+        </w:tc>
+        <w:tc>
+          <w:tcPr>
+            <w:tcW w:w="936" w:type="dxa"/>
             <w:shd w:val="clear" w:color="auto" w:fill="17365D"/>
             <w:vAlign w:val="center"/>
           </w:tcPr>
@@ -3966,17 +4812,30 @@
                 <w:color w:val="FFFFFF"/>
                 <w:sz w:val="22"/>
               </w:rPr>
-              <w:lastRenderedPageBreak/>
-              <w:t xml:space="preserve">Normalization / </w:t>
-            </w:r>
+              <w:t>Augmentation</w:t>
+            </w:r>
+          </w:p>
+        </w:tc>
+        <w:tc>
+          <w:tcPr>
+            <w:tcW w:w="936" w:type="dxa"/>
+            <w:shd w:val="clear" w:color="auto" w:fill="17365D"/>
+            <w:vAlign w:val="center"/>
+          </w:tcPr>
+          <w:p>
+            <w:pPr>
+              <w:spacing w:after="0"/>
+              <w:rPr>
+                <w:sz w:val="22"/>
+              </w:rPr>
+            </w:pPr>
             <w:r>
               <w:rPr>
                 <w:b/>
                 <w:color w:val="FFFFFF"/>
                 <w:sz w:val="22"/>
               </w:rPr>
-              <w:lastRenderedPageBreak/>
-              <w:t>regularization</w:t>
+              <w:t>Params (M)</w:t>
             </w:r>
           </w:p>
         </w:tc>
@@ -3999,8 +4858,30 @@
                 <w:color w:val="FFFFFF"/>
                 <w:sz w:val="22"/>
               </w:rPr>
-              <w:lastRenderedPageBreak/>
-              <w:t>Augmentation</w:t>
+              <w:t>FLOPs (M)</w:t>
+            </w:r>
+          </w:p>
+        </w:tc>
+        <w:tc>
+          <w:tcPr>
+            <w:tcW w:w="1080" w:type="dxa"/>
+            <w:shd w:val="clear" w:color="auto" w:fill="17365D"/>
+            <w:vAlign w:val="center"/>
+          </w:tcPr>
+          <w:p>
+            <w:pPr>
+              <w:spacing w:after="0"/>
+              <w:rPr>
+                <w:sz w:val="22"/>
+              </w:rPr>
+            </w:pPr>
+            <w:r>
+              <w:rPr>
+                <w:b/>
+                <w:color w:val="FFFFFF"/>
+                <w:sz w:val="22"/>
+              </w:rPr>
+              <w:t>Mean epoch (s)</w:t>
             </w:r>
           </w:p>
         </w:tc>
@@ -4023,115 +4904,25 @@
                 <w:color w:val="FFFFFF"/>
                 <w:sz w:val="22"/>
               </w:rPr>
-              <w:t xml:space="preserve">Params </w:t>
-            </w:r>
+              <w:t>Latency (</w:t>
+            </w:r>
+            <w:proofErr w:type="spellStart"/>
             <w:r>
               <w:rPr>
                 <w:b/>
                 <w:color w:val="FFFFFF"/>
                 <w:sz w:val="22"/>
               </w:rPr>
-              <w:lastRenderedPageBreak/>
-              <w:t>(M)</w:t>
-            </w:r>
-          </w:p>
-        </w:tc>
-        <w:tc>
-          <w:tcPr>
-            <w:tcW w:w="936" w:type="dxa"/>
-            <w:shd w:val="clear" w:color="auto" w:fill="17365D"/>
-            <w:vAlign w:val="center"/>
-          </w:tcPr>
-          <w:p>
-            <w:pPr>
-              <w:spacing w:after="0"/>
-              <w:rPr>
-                <w:sz w:val="22"/>
-              </w:rPr>
-            </w:pPr>
+              <w:t>ms</w:t>
+            </w:r>
+            <w:proofErr w:type="spellEnd"/>
             <w:r>
               <w:rPr>
                 <w:b/>
                 <w:color w:val="FFFFFF"/>
                 <w:sz w:val="22"/>
               </w:rPr>
-              <w:lastRenderedPageBreak/>
-              <w:t xml:space="preserve">FLOPs </w:t>
-            </w:r>
-            <w:r>
-              <w:rPr>
-                <w:b/>
-                <w:color w:val="FFFFFF"/>
-                <w:sz w:val="22"/>
-              </w:rPr>
-              <w:lastRenderedPageBreak/>
-              <w:t>(M)</w:t>
-            </w:r>
-          </w:p>
-        </w:tc>
-        <w:tc>
-          <w:tcPr>
-            <w:tcW w:w="1080" w:type="dxa"/>
-            <w:shd w:val="clear" w:color="auto" w:fill="17365D"/>
-            <w:vAlign w:val="center"/>
-          </w:tcPr>
-          <w:p>
-            <w:pPr>
-              <w:spacing w:after="0"/>
-              <w:rPr>
-                <w:sz w:val="22"/>
-              </w:rPr>
-            </w:pPr>
-            <w:r>
-              <w:rPr>
-                <w:b/>
-                <w:color w:val="FFFFFF"/>
-                <w:sz w:val="22"/>
-              </w:rPr>
-              <w:lastRenderedPageBreak/>
-              <w:t xml:space="preserve">Mean </w:t>
-            </w:r>
-            <w:r>
-              <w:rPr>
-                <w:b/>
-                <w:color w:val="FFFFFF"/>
-                <w:sz w:val="22"/>
-              </w:rPr>
-              <w:lastRenderedPageBreak/>
-              <w:t>epoch (s)</w:t>
-            </w:r>
-          </w:p>
-        </w:tc>
-        <w:tc>
-          <w:tcPr>
-            <w:tcW w:w="936" w:type="dxa"/>
-            <w:shd w:val="clear" w:color="auto" w:fill="17365D"/>
-            <w:vAlign w:val="center"/>
-          </w:tcPr>
-          <w:p>
-            <w:pPr>
-              <w:spacing w:after="0"/>
-              <w:rPr>
-                <w:sz w:val="22"/>
-              </w:rPr>
-            </w:pPr>
-            <w:r>
-              <w:rPr>
-                <w:b/>
-                <w:color w:val="FFFFFF"/>
-                <w:sz w:val="22"/>
-              </w:rPr>
-              <w:lastRenderedPageBreak/>
-              <w:t xml:space="preserve">Latency </w:t>
-            </w:r>
-            <w:r>
-              <w:rPr>
-                <w:b/>
-                <w:color w:val="FFFFFF"/>
-                <w:sz w:val="22"/>
-              </w:rPr>
-              <w:lastRenderedPageBreak/>
-              <w:t>(ms)</w:t>
+              <w:t>)</w:t>
             </w:r>
           </w:p>
         </w:tc>
@@ -4156,7 +4947,6 @@
               <w:rPr>
                 <w:sz w:val="22"/>
               </w:rPr>
-              <w:lastRenderedPageBreak/>
               <w:t>Base LeNet-5</w:t>
             </w:r>
           </w:p>
@@ -4213,6 +5003,12 @@
                 <w:sz w:val="22"/>
               </w:rPr>
             </w:pPr>
+            <w:r>
+              <w:rPr>
+                <w:sz w:val="22"/>
+              </w:rPr>
+              <w:t>None</w:t>
+            </w:r>
           </w:p>
         </w:tc>
         <w:tc>
@@ -4355,12 +5151,28 @@
                 <w:sz w:val="22"/>
               </w:rPr>
             </w:pPr>
-            <w:r>
-              <w:rPr>
-                <w:sz w:val="22"/>
-              </w:rPr>
-              <w:t>ReLU + overlapping MaxPool</w:t>
-            </w:r>
+            <w:proofErr w:type="spellStart"/>
+            <w:r>
+              <w:rPr>
+                <w:sz w:val="22"/>
+              </w:rPr>
+              <w:t>ReLU</w:t>
+            </w:r>
+            <w:proofErr w:type="spellEnd"/>
+            <w:r>
+              <w:rPr>
+                <w:sz w:val="22"/>
+              </w:rPr>
+              <w:t xml:space="preserve"> + overlapping </w:t>
+            </w:r>
+            <w:proofErr w:type="spellStart"/>
+            <w:r>
+              <w:rPr>
+                <w:sz w:val="22"/>
+              </w:rPr>
+              <w:t>MaxPool</w:t>
+            </w:r>
+            <w:proofErr w:type="spellEnd"/>
           </w:p>
         </w:tc>
         <w:tc>
@@ -4376,6 +5188,12 @@
                 <w:sz w:val="22"/>
               </w:rPr>
             </w:pPr>
+            <w:r>
+              <w:rPr>
+                <w:sz w:val="22"/>
+              </w:rPr>
+              <w:t>None</w:t>
+            </w:r>
           </w:p>
         </w:tc>
         <w:tc>
@@ -4478,11 +5296,19 @@
                 <w:sz w:val="22"/>
               </w:rPr>
             </w:pPr>
-            <w:r>
-              <w:rPr>
-                <w:sz w:val="22"/>
-              </w:rPr>
-              <w:t>AlexNet (no norm)</w:t>
+            <w:proofErr w:type="spellStart"/>
+            <w:r>
+              <w:rPr>
+                <w:sz w:val="22"/>
+              </w:rPr>
+              <w:t>AlexNet</w:t>
+            </w:r>
+            <w:proofErr w:type="spellEnd"/>
+            <w:r>
+              <w:rPr>
+                <w:sz w:val="22"/>
+              </w:rPr>
+              <w:t xml:space="preserve"> (no norm)</w:t>
             </w:r>
           </w:p>
         </w:tc>
@@ -4535,6 +5361,12 @@
                 <w:sz w:val="22"/>
               </w:rPr>
             </w:pPr>
+            <w:r>
+              <w:rPr>
+                <w:sz w:val="22"/>
+              </w:rPr>
+              <w:t>None</w:t>
+            </w:r>
           </w:p>
         </w:tc>
         <w:tc>
@@ -4630,11 +5462,19 @@
                 <w:sz w:val="22"/>
               </w:rPr>
             </w:pPr>
-            <w:r>
-              <w:rPr>
-                <w:sz w:val="22"/>
-              </w:rPr>
-              <w:t>AlexNet + LRN</w:t>
+            <w:proofErr w:type="spellStart"/>
+            <w:r>
+              <w:rPr>
+                <w:sz w:val="22"/>
+              </w:rPr>
+              <w:t>AlexNet</w:t>
+            </w:r>
+            <w:proofErr w:type="spellEnd"/>
+            <w:r>
+              <w:rPr>
+                <w:sz w:val="22"/>
+              </w:rPr>
+              <w:t xml:space="preserve"> + LRN</w:t>
             </w:r>
           </w:p>
         </w:tc>
@@ -4690,6 +5530,12 @@
                 <w:sz w:val="22"/>
               </w:rPr>
             </w:pPr>
+            <w:r>
+              <w:rPr>
+                <w:sz w:val="22"/>
+              </w:rPr>
+              <w:t>None</w:t>
+            </w:r>
           </w:p>
         </w:tc>
         <w:tc>
@@ -4788,12 +5634,28 @@
                 <w:sz w:val="22"/>
               </w:rPr>
             </w:pPr>
-            <w:r>
-              <w:rPr>
-                <w:sz w:val="22"/>
-              </w:rPr>
-              <w:t>AlexNet + BatchNorm</w:t>
-            </w:r>
+            <w:proofErr w:type="spellStart"/>
+            <w:r>
+              <w:rPr>
+                <w:sz w:val="22"/>
+              </w:rPr>
+              <w:t>AlexNet</w:t>
+            </w:r>
+            <w:proofErr w:type="spellEnd"/>
+            <w:r>
+              <w:rPr>
+                <w:sz w:val="22"/>
+              </w:rPr>
+              <w:t xml:space="preserve"> + </w:t>
+            </w:r>
+            <w:proofErr w:type="spellStart"/>
+            <w:r>
+              <w:rPr>
+                <w:sz w:val="22"/>
+              </w:rPr>
+              <w:t>BatchNorm</w:t>
+            </w:r>
+            <w:proofErr w:type="spellEnd"/>
           </w:p>
         </w:tc>
         <w:tc>
@@ -4845,6 +5707,12 @@
                 <w:sz w:val="22"/>
               </w:rPr>
             </w:pPr>
+            <w:r>
+              <w:rPr>
+                <w:sz w:val="22"/>
+              </w:rPr>
+              <w:t>None</w:t>
+            </w:r>
           </w:p>
         </w:tc>
         <w:tc>
@@ -4941,11 +5809,19 @@
                 <w:sz w:val="22"/>
               </w:rPr>
             </w:pPr>
-            <w:r>
-              <w:rPr>
-                <w:sz w:val="22"/>
-              </w:rPr>
-              <w:t>AlexNet + BN + Aug</w:t>
+            <w:proofErr w:type="spellStart"/>
+            <w:r>
+              <w:rPr>
+                <w:sz w:val="22"/>
+              </w:rPr>
+              <w:t>AlexNet</w:t>
+            </w:r>
+            <w:proofErr w:type="spellEnd"/>
+            <w:r>
+              <w:rPr>
+                <w:sz w:val="22"/>
+              </w:rPr>
+              <w:t xml:space="preserve"> + BN + Aug</w:t>
             </w:r>
           </w:p>
         </w:tc>
@@ -5004,6 +5880,20 @@
                 <w:sz w:val="22"/>
               </w:rPr>
             </w:pPr>
+            <w:proofErr w:type="spellStart"/>
+            <w:r>
+              <w:rPr>
+                <w:sz w:val="22"/>
+              </w:rPr>
+              <w:t>Pytorch</w:t>
+            </w:r>
+            <w:proofErr w:type="spellEnd"/>
+            <w:r>
+              <w:rPr>
+                <w:sz w:val="22"/>
+              </w:rPr>
+              <w:t xml:space="preserve"> Aug</w:t>
+            </w:r>
           </w:p>
         </w:tc>
         <w:tc>
@@ -5107,12 +5997,28 @@
                 <w:sz w:val="22"/>
               </w:rPr>
             </w:pPr>
-            <w:r>
-              <w:rPr>
-                <w:sz w:val="22"/>
-              </w:rPr>
-              <w:t>PyTorch Zoo AlexNet</w:t>
-            </w:r>
+            <w:proofErr w:type="spellStart"/>
+            <w:r>
+              <w:rPr>
+                <w:sz w:val="22"/>
+              </w:rPr>
+              <w:t>PyTorch</w:t>
+            </w:r>
+            <w:proofErr w:type="spellEnd"/>
+            <w:r>
+              <w:rPr>
+                <w:sz w:val="22"/>
+              </w:rPr>
+              <w:t xml:space="preserve"> Zoo </w:t>
+            </w:r>
+            <w:proofErr w:type="spellStart"/>
+            <w:r>
+              <w:rPr>
+                <w:sz w:val="22"/>
+              </w:rPr>
+              <w:t>AlexNet</w:t>
+            </w:r>
+            <w:proofErr w:type="spellEnd"/>
           </w:p>
         </w:tc>
         <w:tc>
@@ -5147,11 +6053,33 @@
                 <w:sz w:val="22"/>
               </w:rPr>
             </w:pPr>
-            <w:r>
-              <w:rPr>
-                <w:sz w:val="22"/>
-              </w:rPr>
-              <w:t>Torchvision AlexNet; Dropout p=0.5</w:t>
+            <w:proofErr w:type="spellStart"/>
+            <w:r>
+              <w:rPr>
+                <w:sz w:val="22"/>
+              </w:rPr>
+              <w:t>Torchvision</w:t>
+            </w:r>
+            <w:proofErr w:type="spellEnd"/>
+            <w:r>
+              <w:rPr>
+                <w:sz w:val="22"/>
+              </w:rPr>
+              <w:t xml:space="preserve"> </w:t>
+            </w:r>
+            <w:proofErr w:type="spellStart"/>
+            <w:r>
+              <w:rPr>
+                <w:sz w:val="22"/>
+              </w:rPr>
+              <w:t>AlexNet</w:t>
+            </w:r>
+            <w:proofErr w:type="spellEnd"/>
+            <w:r>
+              <w:rPr>
+                <w:sz w:val="22"/>
+              </w:rPr>
+              <w:t>; Dropout p=0.5</w:t>
             </w:r>
           </w:p>
         </w:tc>
@@ -5167,6 +6095,12 @@
                 <w:sz w:val="22"/>
               </w:rPr>
             </w:pPr>
+            <w:r>
+              <w:rPr>
+                <w:sz w:val="22"/>
+              </w:rPr>
+              <w:t>None</w:t>
+            </w:r>
           </w:p>
         </w:tc>
         <w:tc>
@@ -5222,6 +6156,9 @@
               </w:rPr>
             </w:pPr>
             <w:r>
+              <w:rPr>
+                <w:sz w:val="22"/>
+              </w:rPr>
               <w:t>160.79</w:t>
             </w:r>
           </w:p>
@@ -5254,8 +6191,63 @@
         <w:pStyle w:val="Heading2"/>
       </w:pPr>
       <w:r>
+        <w:lastRenderedPageBreak/>
         <w:t>Predictive performance across datasets</w:t>
       </w:r>
+    </w:p>
+    <w:p>
+      <w:pPr>
+        <w:rPr>
+          <w:sz w:val="22"/>
+        </w:rPr>
+      </w:pPr>
+      <w:r>
+        <w:rPr>
+          <w:sz w:val="22"/>
+        </w:rPr>
+        <w:t>Table 8 reports final-epoch validation metrics except where a best-epoch value is explicitly labelled. The Tiny ImageNet LRN run used learning rate 0.0001, whereas the other listed AlexNet normalization runs used 0.001; this limits direct comparison. The Zoo AlexNet Tiny ImageNet final values are 8.09% accuracy and 5.35% Macro F1</w:t>
+      </w:r>
+      <w:r>
+        <w:rPr>
+          <w:sz w:val="22"/>
+        </w:rPr>
+        <w:t>.</w:t>
+      </w:r>
+    </w:p>
+    <w:p>
+      <w:pPr>
+        <w:pStyle w:val="Caption"/>
+        <w:keepNext/>
+      </w:pPr>
+      <w:r>
+        <w:t xml:space="preserve">Table </w:t>
+      </w:r>
+      <w:r>
+        <w:fldChar w:fldCharType="begin"/>
+      </w:r>
+      <w:r>
+        <w:instrText xml:space="preserve"> SEQ Table \* ARABIC </w:instrText>
+      </w:r>
+      <w:r>
+        <w:fldChar w:fldCharType="separate"/>
+      </w:r>
+      <w:r>
+        <w:rPr>
+          <w:noProof/>
+        </w:rPr>
+        <w:t>8</w:t>
+      </w:r>
+      <w:r>
+        <w:fldChar w:fldCharType="end"/>
+      </w:r>
+      <w:r>
+        <w:t xml:space="preserve">: Predictive performance across datasets and CNN </w:t>
+      </w:r>
+      <w:proofErr w:type="spellStart"/>
+      <w:r>
+        <w:t>archetictures</w:t>
+      </w:r>
+      <w:proofErr w:type="spellEnd"/>
     </w:p>
     <w:tbl>
       <w:tblPr>
@@ -5317,7 +6309,25 @@
                 <w:color w:val="FFFFFF"/>
                 <w:sz w:val="22"/>
               </w:rPr>
-              <w:t>CIFAR-10 val acc (%)</w:t>
+              <w:t xml:space="preserve">CIFAR-10 </w:t>
+            </w:r>
+            <w:proofErr w:type="spellStart"/>
+            <w:r>
+              <w:rPr>
+                <w:b/>
+                <w:color w:val="FFFFFF"/>
+                <w:sz w:val="22"/>
+              </w:rPr>
+              <w:t>val</w:t>
+            </w:r>
+            <w:proofErr w:type="spellEnd"/>
+            <w:r>
+              <w:rPr>
+                <w:b/>
+                <w:color w:val="FFFFFF"/>
+                <w:sz w:val="22"/>
+              </w:rPr>
+              <w:t xml:space="preserve"> acc (%)</w:t>
             </w:r>
           </w:p>
         </w:tc>
@@ -5363,7 +6373,25 @@
                 <w:color w:val="FFFFFF"/>
                 <w:sz w:val="22"/>
               </w:rPr>
-              <w:t>Tiny ImageNet val acc (%)</w:t>
+              <w:t xml:space="preserve">Tiny ImageNet </w:t>
+            </w:r>
+            <w:proofErr w:type="spellStart"/>
+            <w:r>
+              <w:rPr>
+                <w:b/>
+                <w:color w:val="FFFFFF"/>
+                <w:sz w:val="22"/>
+              </w:rPr>
+              <w:t>val</w:t>
+            </w:r>
+            <w:proofErr w:type="spellEnd"/>
+            <w:r>
+              <w:rPr>
+                <w:b/>
+                <w:color w:val="FFFFFF"/>
+                <w:sz w:val="22"/>
+              </w:rPr>
+              <w:t xml:space="preserve"> acc (%)</w:t>
             </w:r>
           </w:p>
         </w:tc>
@@ -5629,11 +6657,19 @@
                 <w:sz w:val="22"/>
               </w:rPr>
             </w:pPr>
-            <w:r>
-              <w:rPr>
-                <w:sz w:val="22"/>
-              </w:rPr>
-              <w:t>AlexNet (no norm)</w:t>
+            <w:proofErr w:type="spellStart"/>
+            <w:r>
+              <w:rPr>
+                <w:sz w:val="22"/>
+              </w:rPr>
+              <w:t>AlexNet</w:t>
+            </w:r>
+            <w:proofErr w:type="spellEnd"/>
+            <w:r>
+              <w:rPr>
+                <w:sz w:val="22"/>
+              </w:rPr>
+              <w:t xml:space="preserve"> (no norm)</w:t>
             </w:r>
           </w:p>
         </w:tc>
@@ -5686,6 +6722,18 @@
                 <w:sz w:val="22"/>
               </w:rPr>
             </w:pPr>
+            <w:r>
+              <w:rPr>
+                <w:sz w:val="22"/>
+              </w:rPr>
+              <w:t>14.94 (10 epoch</w:t>
+            </w:r>
+            <w:r>
+              <w:rPr>
+                <w:sz w:val="22"/>
+              </w:rPr>
+              <w:t>s)</w:t>
+            </w:r>
           </w:p>
         </w:tc>
         <w:tc>
@@ -5699,6 +6747,24 @@
                 <w:sz w:val="22"/>
               </w:rPr>
             </w:pPr>
+            <w:r>
+              <w:rPr>
+                <w:sz w:val="22"/>
+              </w:rPr>
+              <w:t>12.71 (10 epoch</w:t>
+            </w:r>
+            <w:r>
+              <w:rPr>
+                <w:sz w:val="22"/>
+              </w:rPr>
+              <w:t>s</w:t>
+            </w:r>
+            <w:r>
+              <w:rPr>
+                <w:sz w:val="22"/>
+              </w:rPr>
+              <w:t>)</w:t>
+            </w:r>
           </w:p>
         </w:tc>
       </w:tr>
@@ -5718,11 +6784,19 @@
                 <w:sz w:val="22"/>
               </w:rPr>
             </w:pPr>
-            <w:r>
-              <w:rPr>
-                <w:sz w:val="22"/>
-              </w:rPr>
-              <w:t>AlexNet + LRN</w:t>
+            <w:proofErr w:type="spellStart"/>
+            <w:r>
+              <w:rPr>
+                <w:sz w:val="22"/>
+              </w:rPr>
+              <w:t>AlexNet</w:t>
+            </w:r>
+            <w:proofErr w:type="spellEnd"/>
+            <w:r>
+              <w:rPr>
+                <w:sz w:val="22"/>
+              </w:rPr>
+              <w:t xml:space="preserve"> + LRN</w:t>
             </w:r>
           </w:p>
         </w:tc>
@@ -5778,6 +6852,12 @@
                 <w:sz w:val="22"/>
               </w:rPr>
             </w:pPr>
+            <w:r>
+              <w:rPr>
+                <w:sz w:val="22"/>
+              </w:rPr>
+              <w:t>21.86 (10 epochs)</w:t>
+            </w:r>
           </w:p>
         </w:tc>
         <w:tc>
@@ -5787,11 +6867,9 @@
             <w:vAlign w:val="center"/>
           </w:tcPr>
           <w:p>
-            <w:pPr>
-              <w:rPr>
-                <w:sz w:val="22"/>
-              </w:rPr>
-            </w:pPr>
+            <w:r>
+              <w:t>18.87 (10 epochs)</w:t>
+            </w:r>
           </w:p>
         </w:tc>
       </w:tr>
@@ -5810,12 +6888,28 @@
                 <w:sz w:val="22"/>
               </w:rPr>
             </w:pPr>
-            <w:r>
-              <w:rPr>
-                <w:sz w:val="22"/>
-              </w:rPr>
-              <w:t>AlexNet + BatchNorm</w:t>
-            </w:r>
+            <w:proofErr w:type="spellStart"/>
+            <w:r>
+              <w:rPr>
+                <w:sz w:val="22"/>
+              </w:rPr>
+              <w:t>AlexNet</w:t>
+            </w:r>
+            <w:proofErr w:type="spellEnd"/>
+            <w:r>
+              <w:rPr>
+                <w:sz w:val="22"/>
+              </w:rPr>
+              <w:t xml:space="preserve"> + </w:t>
+            </w:r>
+            <w:proofErr w:type="spellStart"/>
+            <w:r>
+              <w:rPr>
+                <w:sz w:val="22"/>
+              </w:rPr>
+              <w:t>BatchNorm</w:t>
+            </w:r>
+            <w:proofErr w:type="spellEnd"/>
           </w:p>
         </w:tc>
         <w:tc>
@@ -5912,11 +7006,19 @@
                 <w:sz w:val="22"/>
               </w:rPr>
             </w:pPr>
-            <w:r>
-              <w:rPr>
-                <w:sz w:val="22"/>
-              </w:rPr>
-              <w:t>AlexNet + BN + Aug</w:t>
+            <w:proofErr w:type="spellStart"/>
+            <w:r>
+              <w:rPr>
+                <w:sz w:val="22"/>
+              </w:rPr>
+              <w:t>AlexNet</w:t>
+            </w:r>
+            <w:proofErr w:type="spellEnd"/>
+            <w:r>
+              <w:rPr>
+                <w:sz w:val="22"/>
+              </w:rPr>
+              <w:t xml:space="preserve"> + BN + Aug</w:t>
             </w:r>
           </w:p>
         </w:tc>
@@ -5972,6 +7074,18 @@
                 <w:sz w:val="22"/>
               </w:rPr>
             </w:pPr>
+            <w:r>
+              <w:rPr>
+                <w:sz w:val="22"/>
+              </w:rPr>
+              <w:t xml:space="preserve">38.52 </w:t>
+            </w:r>
+            <w:r>
+              <w:rPr>
+                <w:sz w:val="22"/>
+              </w:rPr>
+              <w:t>(15 epochs)</w:t>
+            </w:r>
           </w:p>
         </w:tc>
         <w:tc>
@@ -5986,6 +7100,18 @@
                 <w:sz w:val="22"/>
               </w:rPr>
             </w:pPr>
+            <w:r>
+              <w:rPr>
+                <w:sz w:val="22"/>
+              </w:rPr>
+              <w:t xml:space="preserve">37.27 </w:t>
+            </w:r>
+            <w:r>
+              <w:rPr>
+                <w:sz w:val="22"/>
+              </w:rPr>
+              <w:t>(15 epochs)</w:t>
+            </w:r>
           </w:p>
         </w:tc>
       </w:tr>
@@ -6005,12 +7131,28 @@
                 <w:sz w:val="22"/>
               </w:rPr>
             </w:pPr>
-            <w:r>
-              <w:rPr>
-                <w:sz w:val="22"/>
-              </w:rPr>
-              <w:t>PyTorch Zoo AlexNet</w:t>
-            </w:r>
+            <w:proofErr w:type="spellStart"/>
+            <w:r>
+              <w:rPr>
+                <w:sz w:val="22"/>
+              </w:rPr>
+              <w:t>PyTorch</w:t>
+            </w:r>
+            <w:proofErr w:type="spellEnd"/>
+            <w:r>
+              <w:rPr>
+                <w:sz w:val="22"/>
+              </w:rPr>
+              <w:t xml:space="preserve"> Zoo </w:t>
+            </w:r>
+            <w:proofErr w:type="spellStart"/>
+            <w:r>
+              <w:rPr>
+                <w:sz w:val="22"/>
+              </w:rPr>
+              <w:t>AlexNet</w:t>
+            </w:r>
+            <w:proofErr w:type="spellEnd"/>
           </w:p>
         </w:tc>
         <w:tc>
@@ -6057,11 +7199,9 @@
             <w:vAlign w:val="center"/>
           </w:tcPr>
           <w:p>
-            <w:pPr>
-              <w:rPr>
-                <w:sz w:val="22"/>
-              </w:rPr>
-            </w:pPr>
+            <w:r>
+              <w:t>8.09 (final; best 8.39)</w:t>
+            </w:r>
           </w:p>
         </w:tc>
         <w:tc>
@@ -6070,21 +7210,368 @@
             <w:vAlign w:val="center"/>
           </w:tcPr>
           <w:p>
-            <w:pPr>
-              <w:rPr>
-                <w:sz w:val="22"/>
-              </w:rPr>
-            </w:pPr>
+            <w:r>
+              <w:t>5.35 (final; best 5.58)</w:t>
+            </w:r>
           </w:p>
         </w:tc>
       </w:tr>
     </w:tbl>
     <w:p>
       <w:pPr>
+        <w:pStyle w:val="Heading1"/>
+        <w:rPr>
+          <w:lang w:val="en-CA"/>
+        </w:rPr>
+      </w:pPr>
+      <w:r>
+        <w:rPr>
+          <w:lang w:val="en-CA"/>
+        </w:rPr>
+        <w:t>Technical Analysis &amp; Discussion</w:t>
+      </w:r>
+    </w:p>
+    <w:p>
+      <w:pPr>
         <w:pStyle w:val="Heading2"/>
+        <w:rPr>
+          <w:lang w:val="en-CA"/>
+        </w:rPr>
       </w:pPr>
       <w:r>
-        <w:t>Figures</w:t>
+        <w:rPr>
+          <w:lang w:val="en-CA"/>
+        </w:rPr>
+        <w:t>Overall Model Performance</w:t>
+      </w:r>
+    </w:p>
+    <w:p>
+      <w:pPr>
+        <w:rPr>
+          <w:sz w:val="22"/>
+          <w:lang w:val="en-CA"/>
+        </w:rPr>
+      </w:pPr>
+      <w:r>
+        <w:rPr>
+          <w:sz w:val="22"/>
+          <w:lang w:val="en-CA"/>
+        </w:rPr>
+        <w:t xml:space="preserve">The modernized LeNet performed better than the original LeNet on both datasets. On CIFAR-10, accuracy improved from 52.78% to 66.66%, while Tiny ImageNet accuracy improved from 11.29% to 19.97%. This was likely because the modernized model used </w:t>
+      </w:r>
+      <w:proofErr w:type="spellStart"/>
+      <w:r>
+        <w:rPr>
+          <w:sz w:val="22"/>
+          <w:lang w:val="en-CA"/>
+        </w:rPr>
+        <w:t>ReLU</w:t>
+      </w:r>
+      <w:proofErr w:type="spellEnd"/>
+      <w:r>
+        <w:rPr>
+          <w:sz w:val="22"/>
+          <w:lang w:val="en-CA"/>
+        </w:rPr>
+        <w:t>, padding, and max pooling, which helped it learn image features more effectively.</w:t>
+      </w:r>
+    </w:p>
+    <w:p>
+      <w:pPr>
+        <w:pStyle w:val="Heading2"/>
+        <w:rPr>
+          <w:lang w:val="en-CA"/>
+        </w:rPr>
+      </w:pPr>
+      <w:r>
+        <w:rPr>
+          <w:lang w:val="en-CA"/>
+        </w:rPr>
+        <w:t>Normalization and Optimization</w:t>
+      </w:r>
+    </w:p>
+    <w:p>
+      <w:pPr>
+        <w:rPr>
+          <w:sz w:val="22"/>
+          <w:lang w:val="en-CA"/>
+        </w:rPr>
+      </w:pPr>
+      <w:proofErr w:type="spellStart"/>
+      <w:r>
+        <w:rPr>
+          <w:sz w:val="22"/>
+          <w:lang w:val="en-CA"/>
+        </w:rPr>
+        <w:t>BatchNorm</w:t>
+      </w:r>
+      <w:proofErr w:type="spellEnd"/>
+      <w:r>
+        <w:rPr>
+          <w:sz w:val="22"/>
+          <w:lang w:val="en-CA"/>
+        </w:rPr>
+        <w:t xml:space="preserve"> performed the best out of the three normalization methods. On CIFAR-10, it achieved 79.62% validation accuracy and 79.40% Macro F1, compared to around 73% for both LRN and no normalization. </w:t>
+      </w:r>
+      <w:proofErr w:type="spellStart"/>
+      <w:r>
+        <w:rPr>
+          <w:sz w:val="22"/>
+          <w:lang w:val="en-CA"/>
+        </w:rPr>
+        <w:t>BatchNorm</w:t>
+      </w:r>
+      <w:proofErr w:type="spellEnd"/>
+      <w:r>
+        <w:rPr>
+          <w:sz w:val="22"/>
+          <w:lang w:val="en-CA"/>
+        </w:rPr>
+        <w:t xml:space="preserve"> helps keep the values passing through the network more consistent, making training easier. </w:t>
+      </w:r>
+    </w:p>
+    <w:p>
+      <w:pPr>
+        <w:pStyle w:val="Heading2"/>
+        <w:rPr>
+          <w:lang w:val="en-CA"/>
+        </w:rPr>
+      </w:pPr>
+      <w:r>
+        <w:rPr>
+          <w:lang w:val="en-CA"/>
+        </w:rPr>
+        <w:t>Data Augmentation and Generalization</w:t>
+      </w:r>
+    </w:p>
+    <w:p>
+      <w:pPr>
+        <w:rPr>
+          <w:sz w:val="22"/>
+          <w:lang w:val="en-CA"/>
+        </w:rPr>
+      </w:pPr>
+      <w:r>
+        <w:rPr>
+          <w:sz w:val="22"/>
+          <w:lang w:val="en-CA"/>
+        </w:rPr>
+        <w:t>Data augmentation helped reduce overfitting. Without augmentation, the generalization gap was 8.68 percent, compared to 2.71 with augmentation. Although training accuracy was lower with augmentation, validation accuracy improved slightly from 81.66% to 81.95%. This suggests that augmentation helped the model perform better on unseen images rather than simply learning the training data.</w:t>
+      </w:r>
+    </w:p>
+    <w:p>
+      <w:pPr>
+        <w:pStyle w:val="Heading2"/>
+        <w:rPr>
+          <w:lang w:val="en-CA"/>
+        </w:rPr>
+      </w:pPr>
+      <w:r>
+        <w:rPr>
+          <w:lang w:val="en-CA"/>
+        </w:rPr>
+        <w:t>Why Tiny ImageNet Was Harder</w:t>
+      </w:r>
+    </w:p>
+    <w:p>
+      <w:pPr>
+        <w:rPr>
+          <w:sz w:val="22"/>
+          <w:lang w:val="en-CA"/>
+        </w:rPr>
+      </w:pPr>
+      <w:r>
+        <w:rPr>
+          <w:sz w:val="22"/>
+          <w:lang w:val="en-CA"/>
+        </w:rPr>
+        <w:t xml:space="preserve">All models performed worse on Tiny ImageNet than CIFAR-10. For example, </w:t>
+      </w:r>
+      <w:proofErr w:type="spellStart"/>
+      <w:r>
+        <w:rPr>
+          <w:sz w:val="22"/>
+          <w:lang w:val="en-CA"/>
+        </w:rPr>
+        <w:t>BatchNorm</w:t>
+      </w:r>
+      <w:proofErr w:type="spellEnd"/>
+      <w:r>
+        <w:rPr>
+          <w:sz w:val="22"/>
+          <w:lang w:val="en-CA"/>
+        </w:rPr>
+        <w:t xml:space="preserve"> </w:t>
+      </w:r>
+      <w:proofErr w:type="spellStart"/>
+      <w:r>
+        <w:rPr>
+          <w:sz w:val="22"/>
+          <w:lang w:val="en-CA"/>
+        </w:rPr>
+        <w:t>AlexNet</w:t>
+      </w:r>
+      <w:proofErr w:type="spellEnd"/>
+      <w:r>
+        <w:rPr>
+          <w:sz w:val="22"/>
+          <w:lang w:val="en-CA"/>
+        </w:rPr>
+        <w:t xml:space="preserve"> achieved 79.62% accuracy on CIFAR-10 but only 31.92% on Tiny ImageNet. This is mainly because Tiny ImageNet has 200 classes instead of 10, with more similar-looking categories and fewer training examples per class. </w:t>
+      </w:r>
+    </w:p>
+    <w:p>
+      <w:pPr>
+        <w:pStyle w:val="Heading2"/>
+        <w:rPr>
+          <w:lang w:val="en-CA"/>
+        </w:rPr>
+      </w:pPr>
+      <w:r>
+        <w:rPr>
+          <w:lang w:val="en-CA"/>
+        </w:rPr>
+        <w:t>Model Size and Efficiency</w:t>
+      </w:r>
+    </w:p>
+    <w:p>
+      <w:pPr>
+        <w:rPr>
+          <w:sz w:val="22"/>
+          <w:lang w:val="en-CA"/>
+        </w:rPr>
+      </w:pPr>
+      <w:r>
+        <w:rPr>
+          <w:sz w:val="22"/>
+          <w:lang w:val="en-CA"/>
+        </w:rPr>
+        <w:t xml:space="preserve">The </w:t>
+      </w:r>
+      <w:proofErr w:type="spellStart"/>
+      <w:r>
+        <w:rPr>
+          <w:sz w:val="22"/>
+          <w:lang w:val="en-CA"/>
+        </w:rPr>
+        <w:t>PyTorch</w:t>
+      </w:r>
+      <w:proofErr w:type="spellEnd"/>
+      <w:r>
+        <w:rPr>
+          <w:sz w:val="22"/>
+          <w:lang w:val="en-CA"/>
+        </w:rPr>
+        <w:t xml:space="preserve"> Zoo </w:t>
+      </w:r>
+      <w:proofErr w:type="spellStart"/>
+      <w:r>
+        <w:rPr>
+          <w:sz w:val="22"/>
+          <w:lang w:val="en-CA"/>
+        </w:rPr>
+        <w:t>AlexNet</w:t>
+      </w:r>
+      <w:proofErr w:type="spellEnd"/>
+      <w:r>
+        <w:rPr>
+          <w:sz w:val="22"/>
+          <w:lang w:val="en-CA"/>
+        </w:rPr>
+        <w:t xml:space="preserve"> had 57.82 million parameters, compared to around 6.80 million for the custom </w:t>
+      </w:r>
+      <w:proofErr w:type="spellStart"/>
+      <w:r>
+        <w:rPr>
+          <w:sz w:val="22"/>
+          <w:lang w:val="en-CA"/>
+        </w:rPr>
+        <w:t>AlexNet</w:t>
+      </w:r>
+      <w:proofErr w:type="spellEnd"/>
+      <w:r>
+        <w:rPr>
+          <w:sz w:val="22"/>
+          <w:lang w:val="en-CA"/>
+        </w:rPr>
+        <w:t xml:space="preserve"> on Tiny ImageNet. Despite being much larger, Zoo </w:t>
+      </w:r>
+      <w:proofErr w:type="spellStart"/>
+      <w:r>
+        <w:rPr>
+          <w:sz w:val="22"/>
+          <w:lang w:val="en-CA"/>
+        </w:rPr>
+        <w:t>AlexNet</w:t>
+      </w:r>
+      <w:proofErr w:type="spellEnd"/>
+      <w:r>
+        <w:rPr>
+          <w:sz w:val="22"/>
+          <w:lang w:val="en-CA"/>
+        </w:rPr>
+        <w:t xml:space="preserve"> only achieved 8.09% validation accuracy, showing that a bigger model does not always perform better. </w:t>
+      </w:r>
+    </w:p>
+    <w:p>
+      <w:pPr>
+        <w:pStyle w:val="Heading2"/>
+        <w:rPr>
+          <w:lang w:val="en-CA"/>
+        </w:rPr>
+      </w:pPr>
+      <w:r>
+        <w:rPr>
+          <w:lang w:val="en-CA"/>
+        </w:rPr>
+        <w:lastRenderedPageBreak/>
+        <w:t>Conclusion</w:t>
+      </w:r>
+    </w:p>
+    <w:p>
+      <w:pPr>
+        <w:rPr>
+          <w:sz w:val="22"/>
+          <w:lang w:val="en-CA"/>
+        </w:rPr>
+      </w:pPr>
+      <w:r>
+        <w:rPr>
+          <w:sz w:val="22"/>
+          <w:lang w:val="en-CA"/>
+        </w:rPr>
+        <w:t xml:space="preserve">Overall, </w:t>
+      </w:r>
+      <w:proofErr w:type="spellStart"/>
+      <w:r>
+        <w:rPr>
+          <w:sz w:val="22"/>
+          <w:lang w:val="en-CA"/>
+        </w:rPr>
+        <w:t>BatchNorm</w:t>
+      </w:r>
+      <w:proofErr w:type="spellEnd"/>
+      <w:r>
+        <w:rPr>
+          <w:sz w:val="22"/>
+          <w:lang w:val="en-CA"/>
+        </w:rPr>
+        <w:t xml:space="preserve"> gave the best results, while data augmentation helped reduce overfitting. Modernized LeNet also performed better than the original version. Tiny ImageNet was more challenging because of its larger number of classes.</w:t>
+      </w:r>
+    </w:p>
+    <w:p>
+      <w:pPr>
+        <w:pStyle w:val="Heading1"/>
+        <w:rPr>
+          <w:sz w:val="22"/>
+          <w:lang w:val="en-CA"/>
+        </w:rPr>
+      </w:pPr>
+      <w:r>
+        <w:t>Fig</w:t>
+      </w:r>
+      <w:r>
+        <w:t>ures</w:t>
       </w:r>
     </w:p>
     <w:p>
@@ -6144,14 +7631,27 @@
       <w:r>
         <w:t xml:space="preserve">Figure </w:t>
       </w:r>
-      <w:fldSimple w:instr=" SEQ Figure \* ARABIC ">
-        <w:r>
-          <w:rPr>
-            <w:noProof/>
-          </w:rPr>
-          <w:t>1</w:t>
-        </w:r>
-      </w:fldSimple>
+      <w:r>
+        <w:fldChar w:fldCharType="begin"/>
+      </w:r>
+      <w:r>
+        <w:instrText xml:space="preserve"> SEQ Figure \* ARABIC </w:instrText>
+      </w:r>
+      <w:r>
+        <w:fldChar w:fldCharType="separate"/>
+      </w:r>
+      <w:r>
+        <w:rPr>
+          <w:noProof/>
+        </w:rPr>
+        <w:t>1</w:t>
+      </w:r>
+      <w:r>
+        <w:rPr>
+          <w:noProof/>
+        </w:rPr>
+        <w:fldChar w:fldCharType="end"/>
+      </w:r>
       <w:r>
         <w:t>: loss_lenet.png</w:t>
       </w:r>
@@ -6165,7 +7665,6 @@
         <w:rPr>
           <w:noProof/>
         </w:rPr>
-        <w:lastRenderedPageBreak/>
         <w:drawing>
           <wp:inline distT="0" distB="0" distL="0" distR="0" wp14:anchorId="5AC2E099" wp14:editId="23424428">
             <wp:extent cx="6492240" cy="2705100"/>
@@ -6208,18 +7707,7 @@
         <w:pStyle w:val="Caption"/>
       </w:pPr>
       <w:r>
-        <w:t xml:space="preserve">Figure </w:t>
-      </w:r>
-      <w:fldSimple w:instr=" SEQ Figure \* ARABIC ">
-        <w:r>
-          <w:rPr>
-            <w:noProof/>
-          </w:rPr>
-          <w:t>2</w:t>
-        </w:r>
-      </w:fldSimple>
-      <w:r>
-        <w:t>: loss_lenet_modern.png</w:t>
+        <w:t>Figure 2: AlexNet without normalization — CIFAR-10 (loss and accuracy)</w:t>
       </w:r>
     </w:p>
     <w:p/>
@@ -6231,6 +7719,7 @@
         <w:rPr>
           <w:noProof/>
         </w:rPr>
+        <w:lastRenderedPageBreak/>
         <w:drawing>
           <wp:inline distT="0" distB="0" distL="0" distR="0" wp14:anchorId="44F55077" wp14:editId="403D6ED9">
             <wp:extent cx="6492240" cy="2705100"/>
@@ -6273,18 +7762,7 @@
         <w:pStyle w:val="Caption"/>
       </w:pPr>
       <w:r>
-        <w:t xml:space="preserve">Figure </w:t>
-      </w:r>
-      <w:fldSimple w:instr=" SEQ Figure \* ARABIC ">
-        <w:r>
-          <w:rPr>
-            <w:noProof/>
-          </w:rPr>
-          <w:t>3</w:t>
-        </w:r>
-      </w:fldSimple>
-      <w:r>
-        <w:t>: loss_alexnet_none.png</w:t>
+        <w:t>Figure 3: AlexNet + LRN — CIFAR-10 (loss and accuracy)</w:t>
       </w:r>
     </w:p>
     <w:p/>
@@ -6296,7 +7774,6 @@
         <w:rPr>
           <w:noProof/>
         </w:rPr>
-        <w:lastRenderedPageBreak/>
         <w:drawing>
           <wp:inline distT="0" distB="0" distL="0" distR="0" wp14:anchorId="706CD819" wp14:editId="0FD25D24">
             <wp:extent cx="6492240" cy="2705100"/>
@@ -6339,18 +7816,7 @@
         <w:pStyle w:val="Caption"/>
       </w:pPr>
       <w:r>
-        <w:t xml:space="preserve">Figure </w:t>
-      </w:r>
-      <w:fldSimple w:instr=" SEQ Figure \* ARABIC ">
-        <w:r>
-          <w:rPr>
-            <w:noProof/>
-          </w:rPr>
-          <w:t>4</w:t>
-        </w:r>
-      </w:fldSimple>
-      <w:r>
-        <w:t>: loss_alexnet_lrn.png</w:t>
+        <w:t>Figure 4: AlexNet + BatchNorm — CIFAR-10 (10 epochs)</w:t>
       </w:r>
     </w:p>
     <w:p/>
@@ -6362,6 +7828,7 @@
         <w:rPr>
           <w:noProof/>
         </w:rPr>
+        <w:lastRenderedPageBreak/>
         <w:drawing>
           <wp:inline distT="0" distB="0" distL="0" distR="0" wp14:anchorId="25D82829" wp14:editId="6793C654">
             <wp:extent cx="6492240" cy="2705100"/>
@@ -6404,18 +7871,7 @@
         <w:pStyle w:val="Caption"/>
       </w:pPr>
       <w:r>
-        <w:t xml:space="preserve">Figure </w:t>
-      </w:r>
-      <w:fldSimple w:instr=" SEQ Figure \* ARABIC ">
-        <w:r>
-          <w:rPr>
-            <w:noProof/>
-          </w:rPr>
-          <w:t>5</w:t>
-        </w:r>
-      </w:fldSimple>
-      <w:r>
-        <w:t>: loss_alexnet_bn.png</w:t>
+        <w:t>Figure 5: AlexNet + BatchNorm — CIFAR-10 (15 epochs)</w:t>
       </w:r>
     </w:p>
     <w:p/>
@@ -6427,7 +7883,6 @@
         <w:rPr>
           <w:noProof/>
         </w:rPr>
-        <w:lastRenderedPageBreak/>
         <w:drawing>
           <wp:inline distT="0" distB="0" distL="0" distR="0" wp14:anchorId="59A65706" wp14:editId="2B2C6D6B">
             <wp:extent cx="6492240" cy="2705100"/>
@@ -6470,18 +7925,7 @@
         <w:pStyle w:val="Caption"/>
       </w:pPr>
       <w:r>
-        <w:t xml:space="preserve">Figure </w:t>
-      </w:r>
-      <w:fldSimple w:instr=" SEQ Figure \* ARABIC ">
-        <w:r>
-          <w:rPr>
-            <w:noProof/>
-          </w:rPr>
-          <w:t>6</w:t>
-        </w:r>
-      </w:fldSimple>
-      <w:r>
-        <w:t>: loss_no_aug.png</w:t>
+        <w:t>Figure 6: AlexNet + BatchNorm without augmentation — CIFAR-10</w:t>
       </w:r>
     </w:p>
     <w:p/>
@@ -6493,6 +7937,7 @@
         <w:rPr>
           <w:noProof/>
         </w:rPr>
+        <w:lastRenderedPageBreak/>
         <w:drawing>
           <wp:inline distT="0" distB="0" distL="0" distR="0" wp14:anchorId="4277F5B8" wp14:editId="1C2BC1B3">
             <wp:extent cx="6492240" cy="2705100"/>
@@ -6535,18 +7980,7 @@
         <w:pStyle w:val="Caption"/>
       </w:pPr>
       <w:r>
-        <w:t xml:space="preserve">Figure </w:t>
-      </w:r>
-      <w:fldSimple w:instr=" SEQ Figure \* ARABIC ">
-        <w:r>
-          <w:rPr>
-            <w:noProof/>
-          </w:rPr>
-          <w:t>7</w:t>
-        </w:r>
-      </w:fldSimple>
-      <w:r>
-        <w:t>: loss_with_aug.png</w:t>
+        <w:t>Figure 7: Modernized LeNet — CIFAR-10 (additional plot)</w:t>
       </w:r>
     </w:p>
     <w:p/>
@@ -6558,7 +7992,6 @@
         <w:rPr>
           <w:noProof/>
         </w:rPr>
-        <w:lastRenderedPageBreak/>
         <w:drawing>
           <wp:inline distT="0" distB="0" distL="0" distR="0" wp14:anchorId="308D8623" wp14:editId="0E7C165A">
             <wp:extent cx="6492240" cy="2705100"/>
@@ -6601,18 +8034,7 @@
         <w:pStyle w:val="Caption"/>
       </w:pPr>
       <w:r>
-        <w:t xml:space="preserve">Figure </w:t>
-      </w:r>
-      <w:fldSimple w:instr=" SEQ Figure \* ARABIC ">
-        <w:r>
-          <w:rPr>
-            <w:noProof/>
-          </w:rPr>
-          <w:t>8</w:t>
-        </w:r>
-      </w:fldSimple>
-      <w:r>
-        <w:t>: loss_tiny_imagenet.pn</w:t>
+        <w:t>Figure 8: AlexNet + BatchNorm — Tiny ImageNet (10 epochs)</w:t>
       </w:r>
     </w:p>
     <w:p>
@@ -6623,6 +8045,7 @@
         <w:rPr>
           <w:noProof/>
         </w:rPr>
+        <w:lastRenderedPageBreak/>
         <w:drawing>
           <wp:inline distT="0" distB="0" distL="0" distR="0" wp14:anchorId="69B7F6BF" wp14:editId="29503D15">
             <wp:extent cx="6492240" cy="2705100"/>
@@ -6667,14 +8090,27 @@
       <w:r>
         <w:t xml:space="preserve">Figure </w:t>
       </w:r>
-      <w:fldSimple w:instr=" SEQ Figure \* ARABIC ">
-        <w:r>
-          <w:rPr>
-            <w:noProof/>
-          </w:rPr>
-          <w:t>9</w:t>
-        </w:r>
-      </w:fldSimple>
+      <w:r>
+        <w:fldChar w:fldCharType="begin"/>
+      </w:r>
+      <w:r>
+        <w:instrText xml:space="preserve"> SEQ Figure \* ARABIC </w:instrText>
+      </w:r>
+      <w:r>
+        <w:fldChar w:fldCharType="separate"/>
+      </w:r>
+      <w:r>
+        <w:rPr>
+          <w:noProof/>
+        </w:rPr>
+        <w:t>2</w:t>
+      </w:r>
+      <w:r>
+        <w:rPr>
+          <w:noProof/>
+        </w:rPr>
+        <w:fldChar w:fldCharType="end"/>
+      </w:r>
       <w:r>
         <w:t>: loss_lenet_tiny.png</w:t>
       </w:r>
@@ -6688,7 +8124,6 @@
         <w:rPr>
           <w:noProof/>
         </w:rPr>
-        <w:lastRenderedPageBreak/>
         <w:drawing>
           <wp:inline distT="0" distB="0" distL="0" distR="0" wp14:anchorId="0502D306" wp14:editId="5B2210AE">
             <wp:extent cx="6492240" cy="2705100"/>
@@ -6733,21 +8168,263 @@
       <w:r>
         <w:t xml:space="preserve">Figure </w:t>
       </w:r>
-      <w:fldSimple w:instr=" SEQ Figure \* ARABIC ">
-        <w:r>
-          <w:rPr>
-            <w:noProof/>
-          </w:rPr>
-          <w:t>10</w:t>
-        </w:r>
-      </w:fldSimple>
+      <w:r>
+        <w:fldChar w:fldCharType="begin"/>
+      </w:r>
+      <w:r>
+        <w:instrText xml:space="preserve"> SEQ Figure \* ARABIC </w:instrText>
+      </w:r>
+      <w:r>
+        <w:fldChar w:fldCharType="separate"/>
+      </w:r>
+      <w:r>
+        <w:rPr>
+          <w:noProof/>
+        </w:rPr>
+        <w:t>3</w:t>
+      </w:r>
+      <w:r>
+        <w:rPr>
+          <w:noProof/>
+        </w:rPr>
+        <w:fldChar w:fldCharType="end"/>
+      </w:r>
       <w:r>
         <w:t>: loss_lenet_modern_tiny.png</w:t>
       </w:r>
     </w:p>
+    <w:p>
+      <w:pPr>
+        <w:keepNext/>
+      </w:pPr>
+      <w:r>
+        <w:rPr>
+          <w:noProof/>
+        </w:rPr>
+        <w:lastRenderedPageBreak/>
+        <w:drawing>
+          <wp:inline distT="0" distB="0" distL="0" distR="0" wp14:anchorId="1C16FEFC" wp14:editId="7F5281A2">
+            <wp:extent cx="6492240" cy="2705100"/>
+            <wp:effectExtent l="0" t="0" r="0" b="0"/>
+            <wp:docPr id="612356514" name="Picture 1"/>
+            <wp:cNvGraphicFramePr>
+              <a:graphicFrameLocks xmlns:a="http://schemas.openxmlformats.org/drawingml/2006/main" noChangeAspect="1"/>
+            </wp:cNvGraphicFramePr>
+            <a:graphic xmlns:a="http://schemas.openxmlformats.org/drawingml/2006/main">
+              <a:graphicData uri="http://schemas.openxmlformats.org/drawingml/2006/picture">
+                <pic:pic xmlns:pic="http://schemas.openxmlformats.org/drawingml/2006/picture">
+                  <pic:nvPicPr>
+                    <pic:cNvPr id="612356514" name="Picture 612356514"/>
+                    <pic:cNvPicPr/>
+                  </pic:nvPicPr>
+                  <pic:blipFill>
+                    <a:blip r:embed="rId18"/>
+                    <a:stretch>
+                      <a:fillRect/>
+                    </a:stretch>
+                  </pic:blipFill>
+                  <pic:spPr>
+                    <a:xfrm>
+                      <a:off x="0" y="0"/>
+                      <a:ext cx="6492240" cy="2705100"/>
+                    </a:xfrm>
+                    <a:prstGeom prst="rect">
+                      <a:avLst/>
+                    </a:prstGeom>
+                  </pic:spPr>
+                </pic:pic>
+              </a:graphicData>
+            </a:graphic>
+          </wp:inline>
+        </w:drawing>
+      </w:r>
+    </w:p>
+    <w:p>
+      <w:pPr>
+        <w:pStyle w:val="Caption"/>
+      </w:pPr>
+      <w:r>
+        <w:t xml:space="preserve">Figure </w:t>
+      </w:r>
+      <w:r>
+        <w:fldChar w:fldCharType="begin"/>
+      </w:r>
+      <w:r>
+        <w:instrText xml:space="preserve"> SEQ Figure \* ARABIC </w:instrText>
+      </w:r>
+      <w:r>
+        <w:fldChar w:fldCharType="separate"/>
+      </w:r>
+      <w:r>
+        <w:rPr>
+          <w:noProof/>
+        </w:rPr>
+        <w:t>4</w:t>
+      </w:r>
+      <w:r>
+        <w:fldChar w:fldCharType="end"/>
+      </w:r>
+      <w:r>
+        <w:t>: loss_alexnet_none_tiny.png</w:t>
+      </w:r>
+    </w:p>
+    <w:p>
+      <w:r>
+        <w:t>The successful Tiny ImageNet LRN experiment (learning rate 0.0001) reached 21.86% validation accuracy and 18.87% Macro F1 at epoch 10. Its updated loss plot was not available in this document, so the older failed-run plot is retained only as a clearly labelled diagnostic, not as evidence for the final LRN result.</w:t>
+      </w:r>
+    </w:p>
+    <w:p>
+      <w:r>
+        <w:rPr>
+          <w:noProof/>
+        </w:rPr>
+        <w:drawing>
+          <wp:inline distT="0" distB="0" distL="0" distR="0" wp14:anchorId="3EEAF9EE" wp14:editId="76008F82">
+            <wp:extent cx="6492240" cy="2705100"/>
+            <wp:effectExtent l="0" t="0" r="0" b="0"/>
+            <wp:docPr id="504388564" name="Picture 3"/>
+            <wp:cNvGraphicFramePr>
+              <a:graphicFrameLocks xmlns:a="http://schemas.openxmlformats.org/drawingml/2006/main" noChangeAspect="1"/>
+            </wp:cNvGraphicFramePr>
+            <a:graphic xmlns:a="http://schemas.openxmlformats.org/drawingml/2006/main">
+              <a:graphicData uri="http://schemas.openxmlformats.org/drawingml/2006/picture">
+                <pic:pic xmlns:pic="http://schemas.openxmlformats.org/drawingml/2006/picture">
+                  <pic:nvPicPr>
+                    <pic:cNvPr id="504388564" name="Picture 504388564"/>
+                    <pic:cNvPicPr/>
+                  </pic:nvPicPr>
+                  <pic:blipFill>
+                    <a:blip r:embed="rId19"/>
+                    <a:stretch>
+                      <a:fillRect/>
+                    </a:stretch>
+                  </pic:blipFill>
+                  <pic:spPr>
+                    <a:xfrm>
+                      <a:off x="0" y="0"/>
+                      <a:ext cx="6492240" cy="2705100"/>
+                    </a:xfrm>
+                    <a:prstGeom prst="rect">
+                      <a:avLst/>
+                    </a:prstGeom>
+                  </pic:spPr>
+                </pic:pic>
+              </a:graphicData>
+            </a:graphic>
+          </wp:inline>
+        </w:drawing>
+      </w:r>
+    </w:p>
+    <w:p>
+      <w:pPr>
+        <w:pStyle w:val="Caption"/>
+      </w:pPr>
+      <w:r>
+        <w:t>Figure 1</w:t>
+      </w:r>
+      <w:r>
+        <w:t>2</w:t>
+      </w:r>
+      <w:r>
+        <w:t xml:space="preserve">: </w:t>
+      </w:r>
+      <w:proofErr w:type="spellStart"/>
+      <w:r>
+        <w:t>AlexNet</w:t>
+      </w:r>
+      <w:proofErr w:type="spellEnd"/>
+      <w:r>
+        <w:t xml:space="preserve"> + </w:t>
+      </w:r>
+      <w:proofErr w:type="spellStart"/>
+      <w:r>
+        <w:t>BatchNorm</w:t>
+      </w:r>
+      <w:proofErr w:type="spellEnd"/>
+      <w:r>
+        <w:t xml:space="preserve"> — Tiny ImageNet (15 epochs)</w:t>
+      </w:r>
+    </w:p>
+    <w:p>
+      <w:pPr>
+        <w:keepNext/>
+      </w:pPr>
+      <w:r>
+        <w:rPr>
+          <w:noProof/>
+        </w:rPr>
+        <w:lastRenderedPageBreak/>
+        <w:drawing>
+          <wp:inline distT="0" distB="0" distL="0" distR="0" wp14:anchorId="1AFA50D8" wp14:editId="2B2E7656">
+            <wp:extent cx="6492240" cy="2705100"/>
+            <wp:effectExtent l="0" t="0" r="0" b="0"/>
+            <wp:docPr id="807979641" name="Picture 4"/>
+            <wp:cNvGraphicFramePr>
+              <a:graphicFrameLocks xmlns:a="http://schemas.openxmlformats.org/drawingml/2006/main" noChangeAspect="1"/>
+            </wp:cNvGraphicFramePr>
+            <a:graphic xmlns:a="http://schemas.openxmlformats.org/drawingml/2006/main">
+              <a:graphicData uri="http://schemas.openxmlformats.org/drawingml/2006/picture">
+                <pic:pic xmlns:pic="http://schemas.openxmlformats.org/drawingml/2006/picture">
+                  <pic:nvPicPr>
+                    <pic:cNvPr id="807979641" name="Picture 807979641"/>
+                    <pic:cNvPicPr/>
+                  </pic:nvPicPr>
+                  <pic:blipFill>
+                    <a:blip r:embed="rId20"/>
+                    <a:stretch>
+                      <a:fillRect/>
+                    </a:stretch>
+                  </pic:blipFill>
+                  <pic:spPr>
+                    <a:xfrm>
+                      <a:off x="0" y="0"/>
+                      <a:ext cx="6492240" cy="2705100"/>
+                    </a:xfrm>
+                    <a:prstGeom prst="rect">
+                      <a:avLst/>
+                    </a:prstGeom>
+                  </pic:spPr>
+                </pic:pic>
+              </a:graphicData>
+            </a:graphic>
+          </wp:inline>
+        </w:drawing>
+      </w:r>
+    </w:p>
+    <w:p>
+      <w:pPr>
+        <w:pStyle w:val="Caption"/>
+      </w:pPr>
+      <w:r>
+        <w:t xml:space="preserve">Figure </w:t>
+      </w:r>
+      <w:proofErr w:type="gramStart"/>
+      <w:r>
+        <w:t>1</w:t>
+      </w:r>
+      <w:r>
+        <w:t xml:space="preserve">3 </w:t>
+      </w:r>
+      <w:r>
+        <w:t>:</w:t>
+      </w:r>
+      <w:proofErr w:type="gramEnd"/>
+      <w:r>
+        <w:t xml:space="preserve"> </w:t>
+      </w:r>
+      <w:proofErr w:type="spellStart"/>
+      <w:r>
+        <w:t>PyTorch</w:t>
+      </w:r>
+      <w:proofErr w:type="spellEnd"/>
+      <w:r>
+        <w:t xml:space="preserve"> Zoo AlexNet — Tiny ImageNet (10 epochs)</w:t>
+      </w:r>
+    </w:p>
+    <w:p/>
     <w:sectPr>
-      <w:headerReference w:type="default" r:id="rId18"/>
-      <w:footerReference w:type="default" r:id="rId19"/>
+      <w:headerReference w:type="default" r:id="rId21"/>
+      <w:footerReference w:type="default" r:id="rId22"/>
       <w:pgSz w:w="12240" w:h="15840"/>
       <w:pgMar w:top="936" w:right="1008" w:bottom="936" w:left="1008" w:header="720" w:footer="720" w:gutter="0"/>
       <w:cols w:space="720"/>
@@ -6984,7 +8661,7 @@
   <w:abstractNum w:abstractNumId="8" w15:restartNumberingAfterBreak="0">
     <w:nsid w:val="FFFFFF89"/>
     <w:multiLevelType w:val="singleLevel"/>
-    <w:tmpl w:val="29761A62"/>
+    <w:tmpl w:val="C50AB2F8"/>
     <w:lvl w:ilvl="0">
       <w:start w:val="1"/>
       <w:numFmt w:val="bullet"/>
@@ -18431,6 +20108,16 @@
       <w:sz w:val="16"/>
     </w:rPr>
   </w:style>
+  <w:style w:type="character" w:styleId="PlaceholderText">
+    <w:name w:val="Placeholder Text"/>
+    <w:basedOn w:val="DefaultParagraphFont"/>
+    <w:uiPriority w:val="99"/>
+    <w:semiHidden/>
+    <w:rsid w:val="00363CE2"/>
+    <w:rPr>
+      <w:color w:val="666666"/>
+    </w:rPr>
+  </w:style>
 </w:styles>
 </file>
 

</xml_diff>